<commit_message>
docs: alteração na documentação
</commit_message>
<xml_diff>
--- a/Docs/Documentação-Pedro-Cavani.docx.docx
+++ b/Docs/Documentação-Pedro-Cavani.docx.docx
@@ -56,7 +56,16 @@
           <w:szCs w:val="28"/>
         </w:rPr>
         <w:br/>
-        <w:t>José Mateus Ramiris</w:t>
+      </w:r>
+      <w:r>
+        <w:rPr>
+          <w:rFonts w:cs="Arial"/>
+          <w:b/>
+          <w:bCs/>
+          <w:sz w:val="28"/>
+          <w:szCs w:val="28"/>
+        </w:rPr>
+        <w:t>Pedro Cavani</w:t>
       </w:r>
     </w:p>
     <w:p>
@@ -239,22 +248,17 @@
           <w:sz w:val="28"/>
           <w:szCs w:val="28"/>
         </w:rPr>
-        <w:t>Nome do seu projeto</w:t>
+        <w:t>Smart traffic (Tráfego inte</w:t>
       </w:r>
       <w:r>
         <w:rPr>
           <w:rFonts w:cs="Arial"/>
-          <w:b/>
-          <w:bCs/>
           <w:sz w:val="28"/>
           <w:szCs w:val="28"/>
         </w:rPr>
-        <w:br/>
-      </w:r>
-    </w:p>
-    <w:p>
-      <w:pPr>
-        <w:jc w:val="center"/>
+        <w:t>ligente)</w:t>
+      </w:r>
+      <w:r>
         <w:rPr>
           <w:rFonts w:cs="Arial"/>
           <w:b/>
@@ -262,7 +266,8 @@
           <w:sz w:val="28"/>
           <w:szCs w:val="28"/>
         </w:rPr>
-      </w:pPr>
+        <w:br/>
+      </w:r>
     </w:p>
     <w:p>
       <w:pPr>
@@ -374,14 +379,7 @@
     </w:p>
     <w:p>
       <w:pPr>
-        <w:ind w:firstLine="0"/>
         <w:jc w:val="center"/>
-        <w:rPr>
-          <w:b/>
-          <w:bCs/>
-        </w:rPr>
-      </w:pPr>
-      <w:r>
         <w:rPr>
           <w:rFonts w:cs="Arial"/>
           <w:b/>
@@ -389,8 +387,17 @@
           <w:sz w:val="28"/>
           <w:szCs w:val="28"/>
         </w:rPr>
-        <w:t>Sertãozinho</w:t>
-      </w:r>
+      </w:pPr>
+    </w:p>
+    <w:p>
+      <w:pPr>
+        <w:ind w:firstLine="0"/>
+        <w:jc w:val="center"/>
+        <w:rPr>
+          <w:b/>
+          <w:bCs/>
+        </w:rPr>
+      </w:pPr>
       <w:r>
         <w:rPr>
           <w:rFonts w:cs="Arial"/>
@@ -399,6 +406,16 @@
           <w:sz w:val="28"/>
           <w:szCs w:val="28"/>
         </w:rPr>
+        <w:t>Sertãozinho</w:t>
+      </w:r>
+      <w:r>
+        <w:rPr>
+          <w:rFonts w:cs="Arial"/>
+          <w:b/>
+          <w:bCs/>
+          <w:sz w:val="28"/>
+          <w:szCs w:val="28"/>
+        </w:rPr>
         <w:br/>
       </w:r>
       <w:r>
@@ -419,6 +436,7 @@
     <w:p>
       <w:pPr>
         <w:ind w:firstLine="0"/>
+        <w:jc w:val="center"/>
         <w:rPr>
           <w:b/>
           <w:bCs/>
@@ -436,20 +454,21 @@
     <w:p>
       <w:pPr>
         <w:ind w:firstLine="0"/>
-        <w:rPr>
-          <w:b/>
-          <w:bCs/>
-        </w:rPr>
-      </w:pPr>
-    </w:p>
-    <w:p>
-      <w:pPr>
-        <w:ind w:firstLine="0"/>
-        <w:rPr>
-          <w:b/>
-          <w:bCs/>
-        </w:rPr>
-      </w:pPr>
+      </w:pPr>
+    </w:p>
+    <w:p>
+      <w:pPr>
+        <w:ind w:firstLine="0"/>
+      </w:pPr>
+      <w:r>
+        <w:t xml:space="preserve">Não </w:t>
+      </w:r>
+      <w:r>
+        <w:t>há</w:t>
+      </w:r>
+      <w:r>
+        <w:t xml:space="preserve"> figuras </w:t>
+      </w:r>
     </w:p>
     <w:p>
       <w:pPr>
@@ -746,11 +765,50 @@
         <w:lastRenderedPageBreak/>
         <w:t>Lista de tabelas</w:t>
       </w:r>
-      <w:r>
-        <w:rPr>
-          <w:b/>
-          <w:bCs/>
-        </w:rPr>
+    </w:p>
+    <w:p>
+      <w:pPr>
+        <w:ind w:firstLine="0"/>
+      </w:pPr>
+      <w:r>
+        <w:t>1</w:t>
+      </w:r>
+      <w:r>
+        <w:t xml:space="preserve"> – Tabela de funcionamento</w:t>
+      </w:r>
+    </w:p>
+    <w:p>
+      <w:pPr>
+        <w:ind w:firstLine="0"/>
+      </w:pPr>
+      <w:r>
+        <w:t>2 – Tabela de requisitos funcionais</w:t>
+      </w:r>
+    </w:p>
+    <w:p>
+      <w:pPr>
+        <w:ind w:firstLine="0"/>
+      </w:pPr>
+      <w:r>
+        <w:t>3 – Tabela de requisitos não funcionais</w:t>
+      </w:r>
+    </w:p>
+    <w:p>
+      <w:pPr>
+        <w:ind w:firstLine="0"/>
+      </w:pPr>
+      <w:r>
+        <w:t>4 – Tabela de listas de materiais e equipamentos</w:t>
+      </w:r>
+    </w:p>
+    <w:p>
+      <w:pPr>
+        <w:ind w:firstLine="0"/>
+      </w:pPr>
+      <w:r>
+        <w:t>5 – Tabela de cronograma do projeto</w:t>
+      </w:r>
+      <w:r>
         <w:br/>
       </w:r>
     </w:p>
@@ -979,397 +1037,518 @@
         </w:rPr>
       </w:pPr>
     </w:p>
-    <w:p>
-      <w:pPr>
-        <w:ind w:firstLine="0"/>
-        <w:rPr>
-          <w:b/>
-          <w:bCs/>
-        </w:rPr>
-      </w:pPr>
-    </w:p>
-    <w:p>
-      <w:pPr>
-        <w:ind w:firstLine="0"/>
-        <w:rPr>
-          <w:b/>
-          <w:bCs/>
-        </w:rPr>
-      </w:pPr>
-    </w:p>
-    <w:p>
-      <w:pPr>
-        <w:ind w:firstLine="0"/>
-        <w:rPr>
-          <w:b/>
-          <w:bCs/>
-        </w:rPr>
-      </w:pPr>
-    </w:p>
-    <w:p>
-      <w:pPr>
-        <w:ind w:firstLine="0"/>
-        <w:rPr>
-          <w:b/>
-          <w:bCs/>
-        </w:rPr>
-      </w:pPr>
-    </w:p>
-    <w:p>
-      <w:pPr>
-        <w:ind w:firstLine="0"/>
-        <w:rPr>
-          <w:b/>
-          <w:bCs/>
-        </w:rPr>
-      </w:pPr>
-    </w:p>
-    <w:p>
-      <w:pPr>
-        <w:ind w:firstLine="0"/>
-        <w:rPr>
-          <w:b/>
-          <w:bCs/>
-        </w:rPr>
-      </w:pPr>
-    </w:p>
-    <w:p>
-      <w:pPr>
-        <w:ind w:firstLine="0"/>
-        <w:rPr>
-          <w:b/>
-          <w:bCs/>
-        </w:rPr>
-      </w:pPr>
-    </w:p>
-    <w:p>
-      <w:pPr>
-        <w:ind w:firstLine="0"/>
-        <w:rPr>
-          <w:b/>
-          <w:bCs/>
-        </w:rPr>
-      </w:pPr>
-      <w:r>
-        <w:rPr>
-          <w:b/>
-          <w:bCs/>
-        </w:rPr>
-        <w:lastRenderedPageBreak/>
-        <w:t>Sumário</w:t>
-      </w:r>
-    </w:p>
-    <w:p>
-      <w:pPr>
-        <w:ind w:firstLine="0"/>
-        <w:rPr>
-          <w:b/>
-          <w:bCs/>
-        </w:rPr>
-      </w:pPr>
-    </w:p>
-    <w:p>
-      <w:pPr>
-        <w:ind w:firstLine="0"/>
-        <w:rPr>
-          <w:b/>
-          <w:bCs/>
-        </w:rPr>
-      </w:pPr>
-    </w:p>
-    <w:p>
-      <w:pPr>
-        <w:ind w:firstLine="0"/>
-        <w:rPr>
-          <w:b/>
-          <w:bCs/>
-        </w:rPr>
-      </w:pPr>
-    </w:p>
-    <w:p>
-      <w:pPr>
-        <w:ind w:firstLine="0"/>
-        <w:rPr>
-          <w:b/>
-          <w:bCs/>
-        </w:rPr>
-      </w:pPr>
-    </w:p>
-    <w:p>
-      <w:pPr>
-        <w:ind w:firstLine="0"/>
-        <w:rPr>
-          <w:b/>
-          <w:bCs/>
-        </w:rPr>
-      </w:pPr>
-    </w:p>
-    <w:p>
-      <w:pPr>
-        <w:ind w:firstLine="0"/>
-        <w:rPr>
-          <w:b/>
-          <w:bCs/>
-        </w:rPr>
-      </w:pPr>
-    </w:p>
-    <w:p>
-      <w:pPr>
-        <w:ind w:firstLine="0"/>
-        <w:rPr>
-          <w:b/>
-          <w:bCs/>
-        </w:rPr>
-      </w:pPr>
-    </w:p>
-    <w:p>
-      <w:pPr>
-        <w:ind w:firstLine="0"/>
-        <w:rPr>
-          <w:b/>
-          <w:bCs/>
-        </w:rPr>
-      </w:pPr>
-    </w:p>
-    <w:p>
-      <w:pPr>
-        <w:ind w:firstLine="0"/>
-        <w:rPr>
-          <w:b/>
-          <w:bCs/>
-        </w:rPr>
-      </w:pPr>
-    </w:p>
-    <w:p>
-      <w:pPr>
-        <w:ind w:firstLine="0"/>
-        <w:rPr>
-          <w:b/>
-          <w:bCs/>
-        </w:rPr>
-      </w:pPr>
-    </w:p>
-    <w:p>
-      <w:pPr>
-        <w:ind w:firstLine="0"/>
-        <w:rPr>
-          <w:b/>
-          <w:bCs/>
-        </w:rPr>
-      </w:pPr>
-    </w:p>
-    <w:p>
-      <w:pPr>
-        <w:ind w:firstLine="0"/>
-        <w:rPr>
-          <w:b/>
-          <w:bCs/>
-        </w:rPr>
-      </w:pPr>
-    </w:p>
-    <w:p>
-      <w:pPr>
-        <w:ind w:firstLine="0"/>
-        <w:rPr>
-          <w:b/>
-          <w:bCs/>
-        </w:rPr>
-      </w:pPr>
-    </w:p>
-    <w:p>
-      <w:pPr>
-        <w:ind w:firstLine="0"/>
-        <w:rPr>
-          <w:b/>
-          <w:bCs/>
-        </w:rPr>
-      </w:pPr>
-    </w:p>
-    <w:p>
-      <w:pPr>
-        <w:ind w:firstLine="0"/>
-        <w:rPr>
-          <w:b/>
-          <w:bCs/>
-        </w:rPr>
-      </w:pPr>
-    </w:p>
-    <w:p>
-      <w:pPr>
-        <w:ind w:firstLine="0"/>
-        <w:rPr>
-          <w:b/>
-          <w:bCs/>
-        </w:rPr>
-      </w:pPr>
-    </w:p>
-    <w:p>
-      <w:pPr>
-        <w:ind w:firstLine="0"/>
-        <w:rPr>
-          <w:b/>
-          <w:bCs/>
-        </w:rPr>
-      </w:pPr>
-    </w:p>
-    <w:p>
-      <w:pPr>
-        <w:ind w:firstLine="0"/>
-        <w:rPr>
-          <w:b/>
-          <w:bCs/>
-        </w:rPr>
-      </w:pPr>
-    </w:p>
-    <w:p>
-      <w:pPr>
-        <w:ind w:firstLine="0"/>
-        <w:rPr>
-          <w:b/>
-          <w:bCs/>
-        </w:rPr>
-      </w:pPr>
-    </w:p>
-    <w:p>
-      <w:pPr>
-        <w:ind w:firstLine="0"/>
-        <w:rPr>
-          <w:b/>
-          <w:bCs/>
-        </w:rPr>
-      </w:pPr>
-    </w:p>
-    <w:p>
-      <w:pPr>
-        <w:ind w:firstLine="0"/>
-        <w:rPr>
-          <w:b/>
-          <w:bCs/>
-        </w:rPr>
-      </w:pPr>
-    </w:p>
-    <w:p>
-      <w:pPr>
-        <w:ind w:firstLine="0"/>
-        <w:rPr>
-          <w:b/>
-          <w:bCs/>
-        </w:rPr>
-      </w:pPr>
-    </w:p>
-    <w:p>
-      <w:pPr>
-        <w:ind w:firstLine="0"/>
-        <w:rPr>
-          <w:b/>
-          <w:bCs/>
-        </w:rPr>
-      </w:pPr>
-    </w:p>
-    <w:p>
-      <w:pPr>
-        <w:ind w:firstLine="0"/>
-        <w:rPr>
-          <w:b/>
-          <w:bCs/>
-        </w:rPr>
-      </w:pPr>
-    </w:p>
-    <w:p>
-      <w:pPr>
-        <w:ind w:firstLine="0"/>
-        <w:rPr>
-          <w:b/>
-          <w:bCs/>
-        </w:rPr>
-      </w:pPr>
-    </w:p>
-    <w:p>
-      <w:pPr>
-        <w:ind w:firstLine="0"/>
-        <w:rPr>
-          <w:b/>
-          <w:bCs/>
-        </w:rPr>
-      </w:pPr>
-    </w:p>
-    <w:p>
-      <w:pPr>
-        <w:ind w:firstLine="0"/>
-        <w:rPr>
-          <w:b/>
-          <w:bCs/>
-        </w:rPr>
-      </w:pPr>
-    </w:p>
-    <w:p>
-      <w:pPr>
-        <w:ind w:firstLine="0"/>
-        <w:rPr>
-          <w:b/>
-          <w:bCs/>
-        </w:rPr>
-      </w:pPr>
-    </w:p>
-    <w:p>
-      <w:pPr>
-        <w:ind w:firstLine="0"/>
-        <w:rPr>
-          <w:b/>
-          <w:bCs/>
-        </w:rPr>
-      </w:pPr>
-    </w:p>
-    <w:p>
-      <w:pPr>
-        <w:ind w:firstLine="0"/>
-        <w:rPr>
-          <w:b/>
-          <w:bCs/>
-        </w:rPr>
-      </w:pPr>
-    </w:p>
-    <w:p>
-      <w:pPr>
-        <w:ind w:firstLine="0"/>
-        <w:rPr>
-          <w:b/>
-          <w:bCs/>
-        </w:rPr>
-      </w:pPr>
-    </w:p>
-    <w:p>
-      <w:pPr>
-        <w:ind w:firstLine="0"/>
-        <w:rPr>
-          <w:b/>
-          <w:bCs/>
-        </w:rPr>
-      </w:pPr>
-    </w:p>
-    <w:p>
-      <w:pPr>
-        <w:ind w:firstLine="0"/>
-        <w:rPr>
-          <w:b/>
-          <w:bCs/>
-        </w:rPr>
-      </w:pPr>
-    </w:p>
-    <w:p>
-      <w:pPr>
-        <w:ind w:firstLine="0"/>
-        <w:rPr>
-          <w:b/>
-          <w:bCs/>
-        </w:rPr>
-      </w:pPr>
-      <w:r>
-        <w:rPr>
-          <w:b/>
-          <w:bCs/>
-        </w:rPr>
-        <w:lastRenderedPageBreak/>
+    <w:sdt>
+      <w:sdtPr>
+        <w:rPr>
+          <w:rFonts w:ascii="Arial" w:eastAsiaTheme="minorHAnsi" w:hAnsi="Arial" w:cstheme="minorBidi"/>
+          <w:color w:val="auto"/>
+          <w:sz w:val="24"/>
+          <w:szCs w:val="22"/>
+          <w:lang w:eastAsia="en-US"/>
+        </w:rPr>
+        <w:id w:val="1481963225"/>
+        <w:docPartObj>
+          <w:docPartGallery w:val="Table of Contents"/>
+          <w:docPartUnique/>
+        </w:docPartObj>
+      </w:sdtPr>
+      <w:sdtContent>
+        <w:p>
+          <w:pPr>
+            <w:pStyle w:val="CabealhodoSumrio"/>
+          </w:pPr>
+          <w:r>
+            <w:t>Sumário</w:t>
+          </w:r>
+        </w:p>
+        <w:p>
+          <w:pPr>
+            <w:pStyle w:val="Sumrio1"/>
+          </w:pPr>
+          <w:r>
+            <w:rPr>
+              <w:b/>
+              <w:bCs/>
+            </w:rPr>
+            <w:t>1.CONTEXTUALIZAÇÃO DO PROBLEMA</w:t>
+          </w:r>
+          <w:r>
+            <w:ptab w:relativeTo="margin" w:alignment="right" w:leader="dot"/>
+          </w:r>
+          <w:r>
+            <w:rPr>
+              <w:b/>
+              <w:bCs/>
+            </w:rPr>
+            <w:t>5</w:t>
+          </w:r>
+        </w:p>
+        <w:p>
+          <w:pPr>
+            <w:pStyle w:val="Sumrio2"/>
+            <w:ind w:left="0"/>
+          </w:pPr>
+          <w:r>
+            <w:rPr>
+              <w:b/>
+              <w:bCs/>
+            </w:rPr>
+            <w:t>2.</w:t>
+          </w:r>
+          <w:r>
+            <w:rPr>
+              <w:b/>
+              <w:bCs/>
+            </w:rPr>
+            <w:t>REQUISITOS DO SISTEMA</w:t>
+          </w:r>
+          <w:r>
+            <w:ptab w:relativeTo="margin" w:alignment="right" w:leader="dot"/>
+          </w:r>
+          <w:r>
+            <w:t>6</w:t>
+          </w:r>
+        </w:p>
+        <w:p>
+          <w:pPr>
+            <w:pStyle w:val="Sumrio2"/>
+            <w:ind w:left="0"/>
+          </w:pPr>
+          <w:r>
+            <w:rPr>
+              <w:b/>
+              <w:bCs/>
+            </w:rPr>
+            <w:t>3.</w:t>
+          </w:r>
+          <w:r>
+            <w:rPr>
+              <w:b/>
+              <w:bCs/>
+            </w:rPr>
+            <w:t>LISTA DE MAT</w:t>
+          </w:r>
+          <w:r>
+            <w:rPr>
+              <w:b/>
+              <w:bCs/>
+            </w:rPr>
+            <w:t>E</w:t>
+          </w:r>
+          <w:r>
+            <w:rPr>
+              <w:b/>
+              <w:bCs/>
+            </w:rPr>
+            <w:t>RIAIS E EQUIPAMENTOS</w:t>
+          </w:r>
+          <w:r>
+            <w:ptab w:relativeTo="margin" w:alignment="right" w:leader="dot"/>
+          </w:r>
+          <w:r>
+            <w:t>7</w:t>
+          </w:r>
+        </w:p>
+        <w:p>
+          <w:pPr>
+            <w:pStyle w:val="Sumrio1"/>
+          </w:pPr>
+          <w:r>
+            <w:rPr>
+              <w:b/>
+              <w:bCs/>
+            </w:rPr>
+            <w:t>4.</w:t>
+          </w:r>
+          <w:r>
+            <w:rPr>
+              <w:b/>
+              <w:bCs/>
+            </w:rPr>
+            <w:t>LINGUAGEM DE PROGRAMAÇÃO</w:t>
+          </w:r>
+          <w:r>
+            <w:ptab w:relativeTo="margin" w:alignment="right" w:leader="dot"/>
+          </w:r>
+          <w:r>
+            <w:rPr>
+              <w:b/>
+              <w:bCs/>
+            </w:rPr>
+            <w:t>7</w:t>
+          </w:r>
+        </w:p>
+        <w:p>
+          <w:pPr>
+            <w:pStyle w:val="Sumrio2"/>
+            <w:ind w:left="0"/>
+          </w:pPr>
+          <w:r>
+            <w:rPr>
+              <w:b/>
+              <w:bCs/>
+            </w:rPr>
+            <w:t>5.</w:t>
+          </w:r>
+          <w:r>
+            <w:rPr>
+              <w:b/>
+              <w:bCs/>
+            </w:rPr>
+            <w:t>SISTEMA OPERACIONAL</w:t>
+          </w:r>
+          <w:r>
+            <w:ptab w:relativeTo="margin" w:alignment="right" w:leader="dot"/>
+          </w:r>
+          <w:r>
+            <w:t>8</w:t>
+          </w:r>
+        </w:p>
+        <w:p>
+          <w:pPr>
+            <w:pStyle w:val="Sumrio3"/>
+            <w:ind w:left="0"/>
+          </w:pPr>
+          <w:r>
+            <w:rPr>
+              <w:b/>
+              <w:bCs/>
+            </w:rPr>
+            <w:t>6.</w:t>
+          </w:r>
+          <w:r>
+            <w:rPr>
+              <w:b/>
+              <w:bCs/>
+            </w:rPr>
+            <w:t>CRONOGRAMA DO PROJETO</w:t>
+          </w:r>
+          <w:r>
+            <w:ptab w:relativeTo="margin" w:alignment="right" w:leader="dot"/>
+          </w:r>
+          <w:r>
+            <w:t>8</w:t>
+          </w:r>
+        </w:p>
+        <w:p>
+          <w:pPr>
+            <w:pStyle w:val="Sumrio3"/>
+            <w:ind w:left="0"/>
+          </w:pPr>
+          <w:r>
+            <w:rPr>
+              <w:b/>
+              <w:bCs/>
+            </w:rPr>
+            <w:t>7.</w:t>
+          </w:r>
+          <w:r>
+            <w:rPr>
+              <w:b/>
+              <w:bCs/>
+            </w:rPr>
+            <w:t xml:space="preserve"> </w:t>
+          </w:r>
+          <w:r>
+            <w:rPr>
+              <w:b/>
+              <w:bCs/>
+            </w:rPr>
+            <w:t>REPOSITÓRIO GITHUB</w:t>
+          </w:r>
+          <w:r>
+            <w:t xml:space="preserve"> </w:t>
+          </w:r>
+          <w:r>
+            <w:ptab w:relativeTo="margin" w:alignment="right" w:leader="dot"/>
+          </w:r>
+          <w:r>
+            <w:t>8</w:t>
+          </w:r>
+        </w:p>
+        <w:p>
+          <w:pPr>
+            <w:pStyle w:val="Sumrio3"/>
+            <w:ind w:left="0"/>
+          </w:pPr>
+          <w:r>
+            <w:rPr>
+              <w:b/>
+              <w:bCs/>
+            </w:rPr>
+            <w:t>8.</w:t>
+          </w:r>
+          <w:r>
+            <w:rPr>
+              <w:b/>
+              <w:bCs/>
+            </w:rPr>
+            <w:t xml:space="preserve"> </w:t>
+          </w:r>
+          <w:r>
+            <w:rPr>
+              <w:b/>
+              <w:bCs/>
+            </w:rPr>
+            <w:t>REFERÊNCIAS BIBLIOGRÁFICAS</w:t>
+          </w:r>
+          <w:r>
+            <w:t xml:space="preserve"> </w:t>
+          </w:r>
+          <w:r>
+            <w:ptab w:relativeTo="margin" w:alignment="right" w:leader="dot"/>
+          </w:r>
+          <w:r>
+            <w:t>9</w:t>
+          </w:r>
+        </w:p>
+        <w:p>
+          <w:pPr>
+            <w:rPr>
+              <w:lang w:eastAsia="pt-BR"/>
+            </w:rPr>
+          </w:pPr>
+        </w:p>
+      </w:sdtContent>
+    </w:sdt>
+    <w:p>
+      <w:pPr>
+        <w:ind w:firstLine="0"/>
+        <w:rPr>
+          <w:b/>
+          <w:bCs/>
+        </w:rPr>
+      </w:pPr>
+    </w:p>
+    <w:p>
+      <w:pPr>
+        <w:ind w:firstLine="0"/>
+        <w:rPr>
+          <w:b/>
+          <w:bCs/>
+        </w:rPr>
+      </w:pPr>
+    </w:p>
+    <w:p>
+      <w:pPr>
+        <w:ind w:firstLine="0"/>
+        <w:rPr>
+          <w:b/>
+          <w:bCs/>
+        </w:rPr>
+      </w:pPr>
+    </w:p>
+    <w:p>
+      <w:pPr>
+        <w:ind w:firstLine="0"/>
+        <w:rPr>
+          <w:b/>
+          <w:bCs/>
+        </w:rPr>
+      </w:pPr>
+    </w:p>
+    <w:p>
+      <w:pPr>
+        <w:ind w:firstLine="0"/>
+        <w:rPr>
+          <w:b/>
+          <w:bCs/>
+        </w:rPr>
+      </w:pPr>
+    </w:p>
+    <w:p>
+      <w:pPr>
+        <w:ind w:firstLine="0"/>
+        <w:rPr>
+          <w:b/>
+          <w:bCs/>
+        </w:rPr>
+      </w:pPr>
+    </w:p>
+    <w:p>
+      <w:pPr>
+        <w:ind w:firstLine="0"/>
+        <w:rPr>
+          <w:b/>
+          <w:bCs/>
+        </w:rPr>
+      </w:pPr>
+    </w:p>
+    <w:p>
+      <w:pPr>
+        <w:ind w:firstLine="0"/>
+        <w:rPr>
+          <w:b/>
+          <w:bCs/>
+        </w:rPr>
+      </w:pPr>
+    </w:p>
+    <w:p>
+      <w:pPr>
+        <w:ind w:firstLine="0"/>
+        <w:rPr>
+          <w:b/>
+          <w:bCs/>
+        </w:rPr>
+      </w:pPr>
+    </w:p>
+    <w:p>
+      <w:pPr>
+        <w:ind w:firstLine="0"/>
+        <w:rPr>
+          <w:b/>
+          <w:bCs/>
+        </w:rPr>
+      </w:pPr>
+    </w:p>
+    <w:p>
+      <w:pPr>
+        <w:ind w:firstLine="0"/>
+        <w:rPr>
+          <w:b/>
+          <w:bCs/>
+        </w:rPr>
+      </w:pPr>
+    </w:p>
+    <w:p>
+      <w:pPr>
+        <w:ind w:firstLine="0"/>
+        <w:rPr>
+          <w:b/>
+          <w:bCs/>
+        </w:rPr>
+      </w:pPr>
+    </w:p>
+    <w:p>
+      <w:pPr>
+        <w:ind w:firstLine="0"/>
+        <w:rPr>
+          <w:b/>
+          <w:bCs/>
+        </w:rPr>
+      </w:pPr>
+    </w:p>
+    <w:p>
+      <w:pPr>
+        <w:ind w:firstLine="0"/>
+        <w:rPr>
+          <w:b/>
+          <w:bCs/>
+        </w:rPr>
+      </w:pPr>
+    </w:p>
+    <w:p>
+      <w:pPr>
+        <w:ind w:firstLine="0"/>
+        <w:rPr>
+          <w:b/>
+          <w:bCs/>
+        </w:rPr>
+      </w:pPr>
+    </w:p>
+    <w:p>
+      <w:pPr>
+        <w:ind w:firstLine="0"/>
+        <w:rPr>
+          <w:b/>
+          <w:bCs/>
+        </w:rPr>
+      </w:pPr>
+    </w:p>
+    <w:p>
+      <w:pPr>
+        <w:ind w:firstLine="0"/>
+        <w:rPr>
+          <w:b/>
+          <w:bCs/>
+        </w:rPr>
+      </w:pPr>
+    </w:p>
+    <w:p>
+      <w:pPr>
+        <w:ind w:firstLine="0"/>
+        <w:rPr>
+          <w:b/>
+          <w:bCs/>
+        </w:rPr>
+      </w:pPr>
+    </w:p>
+    <w:p>
+      <w:pPr>
+        <w:ind w:firstLine="0"/>
+        <w:rPr>
+          <w:b/>
+          <w:bCs/>
+        </w:rPr>
+      </w:pPr>
+    </w:p>
+    <w:p>
+      <w:pPr>
+        <w:ind w:firstLine="0"/>
+        <w:rPr>
+          <w:b/>
+          <w:bCs/>
+        </w:rPr>
+      </w:pPr>
+    </w:p>
+    <w:p>
+      <w:pPr>
+        <w:ind w:firstLine="0"/>
+        <w:rPr>
+          <w:b/>
+          <w:bCs/>
+        </w:rPr>
+      </w:pPr>
+    </w:p>
+    <w:p>
+      <w:pPr>
+        <w:ind w:firstLine="0"/>
+        <w:rPr>
+          <w:b/>
+          <w:bCs/>
+        </w:rPr>
+      </w:pPr>
+    </w:p>
+    <w:p>
+      <w:pPr>
+        <w:ind w:firstLine="0"/>
+        <w:rPr>
+          <w:b/>
+          <w:bCs/>
+        </w:rPr>
+      </w:pPr>
+    </w:p>
+    <w:p>
+      <w:pPr>
+        <w:ind w:firstLine="0"/>
+        <w:rPr>
+          <w:b/>
+          <w:bCs/>
+        </w:rPr>
+      </w:pPr>
+    </w:p>
+    <w:p>
+      <w:pPr>
+        <w:ind w:firstLine="0"/>
+        <w:rPr>
+          <w:b/>
+          <w:bCs/>
+        </w:rPr>
+      </w:pPr>
+    </w:p>
+    <w:p>
+      <w:pPr>
+        <w:ind w:firstLine="0"/>
+        <w:rPr>
+          <w:b/>
+          <w:bCs/>
+        </w:rPr>
+      </w:pPr>
+      <w:r>
+        <w:rPr>
+          <w:b/>
+          <w:bCs/>
+        </w:rPr>
         <w:t>1</w:t>
       </w:r>
       <w:r>
@@ -1392,19 +1571,8 @@
         <w:jc w:val="both"/>
       </w:pPr>
       <w:r>
-        <w:t>Descreva o problema....</w:t>
-      </w:r>
-      <w:r>
-        <w:t xml:space="preserve"> </w:t>
-      </w:r>
-      <w:r>
-        <w:t>(lembre-se que o exemplo do notion pode estar superficial, a ideia é ajudar vocês a desenvolver a documentação, para finalizar, todo o texto é de forma discursiva e com suas palavras).</w:t>
-      </w:r>
-    </w:p>
-    <w:p>
-      <w:pPr>
-        <w:jc w:val="both"/>
-      </w:pPr>
+        <w:t>O trânsito em São Paulo é muito congestionado porque os semáforos não se adaptam ao fluxo real de carros, fazendo com que veículos parem sem necessidade, o que aumenta o tempo de viagem e a poluição, por isso é importante criar um semáforo inteligente que ajuste o tempo de acordo com o movimento das vias.</w:t>
+      </w:r>
     </w:p>
     <w:p>
       <w:pPr>
@@ -1437,19 +1605,17 @@
         <w:jc w:val="both"/>
       </w:pPr>
       <w:r>
-        <w:t>Descreve o objetivo do projeto, lembre de utilizar o nome criado por você...</w:t>
-      </w:r>
-      <w:r>
-        <w:t xml:space="preserve"> </w:t>
-      </w:r>
-      <w:r>
-        <w:t>(lembre-se que o exemplo do notion pode estar superficial, a ideia é ajudar vocês a desenvolver a documentação, para finalizar, todo o texto é de forma discursiva e com suas palavras).</w:t>
-      </w:r>
-    </w:p>
-    <w:p>
-      <w:pPr>
-        <w:jc w:val="both"/>
-      </w:pPr>
+        <w:t>O projeto</w:t>
+      </w:r>
+      <w:r>
+        <w:t xml:space="preserve"> Smart traffic</w:t>
+      </w:r>
+      <w:r>
+        <w:t>, tem como objetivo melhorar o trânsito em cruzamentos da cidade de São Paulo, criando um semáforo que se adapte ao movimento dos carros em tempo real, diminuindo congestionamentos e o tempo de espera, além de ajudar a reduzir a poluição e aumentar a segurança no trânsito</w:t>
+      </w:r>
+      <w:r>
+        <w:t>.</w:t>
+      </w:r>
     </w:p>
     <w:p>
       <w:pPr>
@@ -1482,7 +1648,28 @@
         <w:jc w:val="both"/>
       </w:pPr>
       <w:r>
-        <w:t>Descreva a solução proposta (lembre-se que o exemplo do notion pode estar superficial, a ideia é ajudar vocês a desenvolver a documentação, para finalizar, todo o texto é de forma discursiva e com suas palavras).</w:t>
+        <w:t xml:space="preserve">A solução do projeto </w:t>
+      </w:r>
+      <w:r>
+        <w:t>Smart traffic</w:t>
+      </w:r>
+      <w:r>
+        <w:t xml:space="preserve"> é c</w:t>
+      </w:r>
+      <w:r>
+        <w:t>riar um sistema que controla o trânsito de forma automática em São Paulo</w:t>
+      </w:r>
+      <w:r>
+        <w:t>, e</w:t>
+      </w:r>
+      <w:r>
+        <w:t>le usa sensores para identificar a quantidade de carros em cada via. Assim</w:t>
+      </w:r>
+      <w:r>
+        <w:t xml:space="preserve"> </w:t>
+      </w:r>
+      <w:r>
+        <w:t>o semáforo dá mais tempo verde para a rua mais movimentada. Também garante segurança, sem deixar as duas vias abertas ao mesmo tempo.</w:t>
       </w:r>
     </w:p>
     <w:p>
@@ -1516,14 +1703,546 @@
         <w:jc w:val="both"/>
       </w:pPr>
       <w:r>
-        <w:t xml:space="preserve">Descreva o funcionamento (discursiva), na sequencia pode usar a sequência mínima esperada (opcional), o uso da tabela é </w:t>
-      </w:r>
-      <w:r>
-        <w:t xml:space="preserve">obrigatório. </w:t>
-      </w:r>
-      <w:r>
-        <w:t>(lembre-se que o exemplo do notion pode estar superficial, a ideia é ajudar vocês a desenvolver a documentação, para finalizar, todo o texto é de forma discursiva e com suas palavras).</w:t>
-      </w:r>
+        <w:t xml:space="preserve">O </w:t>
+      </w:r>
+      <w:r>
+        <w:t>Smart traffic</w:t>
+      </w:r>
+      <w:r>
+        <w:t xml:space="preserve"> funciona usando sensores para ver quantos carros tem em cada via. Com isso, o sistema decide qual rua fica mais tempo no verde. Ele sempre troca as cores de forma segura, passando por verde, amarelo e vermelho. Assim, evita acidentes e melhora o fluxo do trânsito.</w:t>
+      </w:r>
+    </w:p>
+    <w:tbl>
+      <w:tblPr>
+        <w:tblStyle w:val="Tabelacomgrade"/>
+        <w:tblW w:w="0" w:type="auto"/>
+        <w:tblLook w:val="04A0" w:firstRow="1" w:lastRow="0" w:firstColumn="1" w:lastColumn="0" w:noHBand="0" w:noVBand="1"/>
+      </w:tblPr>
+      <w:tblGrid>
+        <w:gridCol w:w="844"/>
+        <w:gridCol w:w="1561"/>
+        <w:gridCol w:w="1843"/>
+        <w:gridCol w:w="1701"/>
+        <w:gridCol w:w="3112"/>
+      </w:tblGrid>
+      <w:tr>
+        <w:tc>
+          <w:tcPr>
+            <w:tcW w:w="844" w:type="dxa"/>
+          </w:tcPr>
+          <w:p>
+            <w:pPr>
+              <w:ind w:firstLine="0"/>
+              <w:jc w:val="both"/>
+            </w:pPr>
+            <w:r>
+              <w:t>Etapa</w:t>
+            </w:r>
+          </w:p>
+        </w:tc>
+        <w:tc>
+          <w:tcPr>
+            <w:tcW w:w="1561" w:type="dxa"/>
+          </w:tcPr>
+          <w:p>
+            <w:pPr>
+              <w:ind w:firstLine="0"/>
+              <w:jc w:val="both"/>
+            </w:pPr>
+            <w:r>
+              <w:t>Via principal</w:t>
+            </w:r>
+          </w:p>
+        </w:tc>
+        <w:tc>
+          <w:tcPr>
+            <w:tcW w:w="1843" w:type="dxa"/>
+          </w:tcPr>
+          <w:p>
+            <w:pPr>
+              <w:ind w:firstLine="0"/>
+              <w:jc w:val="both"/>
+            </w:pPr>
+            <w:r>
+              <w:t>Via secundária</w:t>
+            </w:r>
+          </w:p>
+        </w:tc>
+        <w:tc>
+          <w:tcPr>
+            <w:tcW w:w="1701" w:type="dxa"/>
+          </w:tcPr>
+          <w:p>
+            <w:pPr>
+              <w:ind w:firstLine="0"/>
+              <w:jc w:val="both"/>
+            </w:pPr>
+            <w:r>
+              <w:t>Tempo</w:t>
+            </w:r>
+          </w:p>
+        </w:tc>
+        <w:tc>
+          <w:tcPr>
+            <w:tcW w:w="3112" w:type="dxa"/>
+          </w:tcPr>
+          <w:p>
+            <w:pPr>
+              <w:ind w:firstLine="0"/>
+              <w:jc w:val="both"/>
+            </w:pPr>
+            <w:r>
+              <w:t>Descrição</w:t>
+            </w:r>
+          </w:p>
+        </w:tc>
+      </w:tr>
+      <w:tr>
+        <w:tc>
+          <w:tcPr>
+            <w:tcW w:w="844" w:type="dxa"/>
+          </w:tcPr>
+          <w:p>
+            <w:pPr>
+              <w:ind w:firstLine="0"/>
+              <w:jc w:val="both"/>
+            </w:pPr>
+            <w:r>
+              <w:t>1</w:t>
+            </w:r>
+          </w:p>
+        </w:tc>
+        <w:tc>
+          <w:tcPr>
+            <w:tcW w:w="1561" w:type="dxa"/>
+          </w:tcPr>
+          <w:p>
+            <w:pPr>
+              <w:ind w:firstLine="0"/>
+              <w:jc w:val="both"/>
+            </w:pPr>
+            <w:r>
+              <w:t>Verde</w:t>
+            </w:r>
+          </w:p>
+        </w:tc>
+        <w:tc>
+          <w:tcPr>
+            <w:tcW w:w="1843" w:type="dxa"/>
+          </w:tcPr>
+          <w:p>
+            <w:pPr>
+              <w:ind w:firstLine="0"/>
+              <w:jc w:val="both"/>
+            </w:pPr>
+            <w:r>
+              <w:t>Vermelho</w:t>
+            </w:r>
+          </w:p>
+        </w:tc>
+        <w:tc>
+          <w:tcPr>
+            <w:tcW w:w="1701" w:type="dxa"/>
+          </w:tcPr>
+          <w:p>
+            <w:pPr>
+              <w:ind w:firstLine="0"/>
+              <w:jc w:val="both"/>
+            </w:pPr>
+            <w:r>
+              <w:t>20 segundos</w:t>
+            </w:r>
+          </w:p>
+        </w:tc>
+        <w:tc>
+          <w:tcPr>
+            <w:tcW w:w="3112" w:type="dxa"/>
+          </w:tcPr>
+          <w:p>
+            <w:pPr>
+              <w:ind w:firstLine="0"/>
+              <w:jc w:val="both"/>
+            </w:pPr>
+            <w:r>
+              <w:t>Fluxo liberado na via principal</w:t>
+            </w:r>
+          </w:p>
+        </w:tc>
+      </w:tr>
+      <w:tr>
+        <w:tc>
+          <w:tcPr>
+            <w:tcW w:w="844" w:type="dxa"/>
+          </w:tcPr>
+          <w:p>
+            <w:pPr>
+              <w:ind w:firstLine="0"/>
+              <w:jc w:val="both"/>
+            </w:pPr>
+            <w:r>
+              <w:t>2</w:t>
+            </w:r>
+          </w:p>
+        </w:tc>
+        <w:tc>
+          <w:tcPr>
+            <w:tcW w:w="1561" w:type="dxa"/>
+          </w:tcPr>
+          <w:p>
+            <w:pPr>
+              <w:ind w:firstLine="0"/>
+              <w:jc w:val="both"/>
+            </w:pPr>
+            <w:r>
+              <w:t>Amarelo</w:t>
+            </w:r>
+          </w:p>
+        </w:tc>
+        <w:tc>
+          <w:tcPr>
+            <w:tcW w:w="1843" w:type="dxa"/>
+          </w:tcPr>
+          <w:p>
+            <w:pPr>
+              <w:ind w:firstLine="0"/>
+              <w:jc w:val="both"/>
+            </w:pPr>
+            <w:r>
+              <w:t>Vermelho</w:t>
+            </w:r>
+          </w:p>
+        </w:tc>
+        <w:tc>
+          <w:tcPr>
+            <w:tcW w:w="1701" w:type="dxa"/>
+          </w:tcPr>
+          <w:p>
+            <w:pPr>
+              <w:ind w:firstLine="0"/>
+              <w:jc w:val="both"/>
+            </w:pPr>
+            <w:r>
+              <w:t>3 segundos</w:t>
+            </w:r>
+          </w:p>
+        </w:tc>
+        <w:tc>
+          <w:tcPr>
+            <w:tcW w:w="3112" w:type="dxa"/>
+          </w:tcPr>
+          <w:p>
+            <w:pPr>
+              <w:ind w:firstLine="0"/>
+              <w:jc w:val="both"/>
+            </w:pPr>
+            <w:r>
+              <w:t>Atenção para a parada da via principal</w:t>
+            </w:r>
+          </w:p>
+        </w:tc>
+      </w:tr>
+      <w:tr>
+        <w:tc>
+          <w:tcPr>
+            <w:tcW w:w="844" w:type="dxa"/>
+          </w:tcPr>
+          <w:p>
+            <w:pPr>
+              <w:ind w:firstLine="0"/>
+              <w:jc w:val="both"/>
+            </w:pPr>
+            <w:r>
+              <w:t>3</w:t>
+            </w:r>
+          </w:p>
+        </w:tc>
+        <w:tc>
+          <w:tcPr>
+            <w:tcW w:w="1561" w:type="dxa"/>
+          </w:tcPr>
+          <w:p>
+            <w:pPr>
+              <w:ind w:firstLine="0"/>
+              <w:jc w:val="both"/>
+            </w:pPr>
+            <w:r>
+              <w:t>Vermelho</w:t>
+            </w:r>
+          </w:p>
+        </w:tc>
+        <w:tc>
+          <w:tcPr>
+            <w:tcW w:w="1843" w:type="dxa"/>
+          </w:tcPr>
+          <w:p>
+            <w:pPr>
+              <w:ind w:firstLine="0"/>
+              <w:jc w:val="both"/>
+            </w:pPr>
+            <w:r>
+              <w:t>Vermelho</w:t>
+            </w:r>
+          </w:p>
+        </w:tc>
+        <w:tc>
+          <w:tcPr>
+            <w:tcW w:w="1701" w:type="dxa"/>
+          </w:tcPr>
+          <w:p>
+            <w:pPr>
+              <w:ind w:firstLine="0"/>
+              <w:jc w:val="both"/>
+            </w:pPr>
+            <w:r>
+              <w:t>1</w:t>
+            </w:r>
+            <w:r>
+              <w:t xml:space="preserve"> segundo</w:t>
+            </w:r>
+          </w:p>
+        </w:tc>
+        <w:tc>
+          <w:tcPr>
+            <w:tcW w:w="3112" w:type="dxa"/>
+          </w:tcPr>
+          <w:p>
+            <w:pPr>
+              <w:ind w:firstLine="0"/>
+              <w:jc w:val="both"/>
+            </w:pPr>
+            <w:r>
+              <w:t>Intervalo de segurança</w:t>
+            </w:r>
+          </w:p>
+        </w:tc>
+      </w:tr>
+      <w:tr>
+        <w:tc>
+          <w:tcPr>
+            <w:tcW w:w="844" w:type="dxa"/>
+          </w:tcPr>
+          <w:p>
+            <w:pPr>
+              <w:ind w:firstLine="0"/>
+              <w:jc w:val="both"/>
+            </w:pPr>
+            <w:r>
+              <w:t>4</w:t>
+            </w:r>
+          </w:p>
+        </w:tc>
+        <w:tc>
+          <w:tcPr>
+            <w:tcW w:w="1561" w:type="dxa"/>
+          </w:tcPr>
+          <w:p>
+            <w:pPr>
+              <w:ind w:firstLine="0"/>
+              <w:jc w:val="both"/>
+            </w:pPr>
+            <w:r>
+              <w:t>Vermelho</w:t>
+            </w:r>
+          </w:p>
+        </w:tc>
+        <w:tc>
+          <w:tcPr>
+            <w:tcW w:w="1843" w:type="dxa"/>
+          </w:tcPr>
+          <w:p>
+            <w:pPr>
+              <w:ind w:firstLine="0"/>
+              <w:jc w:val="both"/>
+            </w:pPr>
+            <w:r>
+              <w:t>Verde</w:t>
+            </w:r>
+          </w:p>
+        </w:tc>
+        <w:tc>
+          <w:tcPr>
+            <w:tcW w:w="1701" w:type="dxa"/>
+          </w:tcPr>
+          <w:p>
+            <w:pPr>
+              <w:ind w:firstLine="0"/>
+              <w:jc w:val="both"/>
+            </w:pPr>
+            <w:r>
+              <w:t>10 segundos</w:t>
+            </w:r>
+          </w:p>
+        </w:tc>
+        <w:tc>
+          <w:tcPr>
+            <w:tcW w:w="3112" w:type="dxa"/>
+          </w:tcPr>
+          <w:p>
+            <w:pPr>
+              <w:ind w:firstLine="0"/>
+              <w:jc w:val="both"/>
+            </w:pPr>
+            <w:r>
+              <w:t>Fluxo liberado na via secundária</w:t>
+            </w:r>
+          </w:p>
+        </w:tc>
+      </w:tr>
+      <w:tr>
+        <w:tc>
+          <w:tcPr>
+            <w:tcW w:w="844" w:type="dxa"/>
+          </w:tcPr>
+          <w:p>
+            <w:pPr>
+              <w:ind w:firstLine="0"/>
+              <w:jc w:val="both"/>
+            </w:pPr>
+            <w:r>
+              <w:lastRenderedPageBreak/>
+              <w:t>5</w:t>
+            </w:r>
+          </w:p>
+        </w:tc>
+        <w:tc>
+          <w:tcPr>
+            <w:tcW w:w="1561" w:type="dxa"/>
+          </w:tcPr>
+          <w:p>
+            <w:pPr>
+              <w:ind w:firstLine="0"/>
+              <w:jc w:val="both"/>
+            </w:pPr>
+            <w:r>
+              <w:t>Vermelho</w:t>
+            </w:r>
+          </w:p>
+        </w:tc>
+        <w:tc>
+          <w:tcPr>
+            <w:tcW w:w="1843" w:type="dxa"/>
+          </w:tcPr>
+          <w:p>
+            <w:pPr>
+              <w:ind w:firstLine="0"/>
+              <w:jc w:val="both"/>
+            </w:pPr>
+            <w:r>
+              <w:t>Amarelo</w:t>
+            </w:r>
+          </w:p>
+        </w:tc>
+        <w:tc>
+          <w:tcPr>
+            <w:tcW w:w="1701" w:type="dxa"/>
+          </w:tcPr>
+          <w:p>
+            <w:pPr>
+              <w:ind w:firstLine="0"/>
+              <w:jc w:val="both"/>
+            </w:pPr>
+            <w:r>
+              <w:t>3 segundos</w:t>
+            </w:r>
+          </w:p>
+        </w:tc>
+        <w:tc>
+          <w:tcPr>
+            <w:tcW w:w="3112" w:type="dxa"/>
+          </w:tcPr>
+          <w:p>
+            <w:pPr>
+              <w:ind w:firstLine="0"/>
+              <w:jc w:val="both"/>
+            </w:pPr>
+            <w:r>
+              <w:t>Atenção para a parada na via secundária</w:t>
+            </w:r>
+          </w:p>
+        </w:tc>
+      </w:tr>
+      <w:tr>
+        <w:tc>
+          <w:tcPr>
+            <w:tcW w:w="844" w:type="dxa"/>
+          </w:tcPr>
+          <w:p>
+            <w:pPr>
+              <w:ind w:firstLine="0"/>
+              <w:jc w:val="both"/>
+            </w:pPr>
+            <w:r>
+              <w:t>6</w:t>
+            </w:r>
+          </w:p>
+        </w:tc>
+        <w:tc>
+          <w:tcPr>
+            <w:tcW w:w="1561" w:type="dxa"/>
+          </w:tcPr>
+          <w:p>
+            <w:pPr>
+              <w:ind w:firstLine="0"/>
+              <w:jc w:val="both"/>
+            </w:pPr>
+            <w:r>
+              <w:t>Vermelho</w:t>
+            </w:r>
+          </w:p>
+        </w:tc>
+        <w:tc>
+          <w:tcPr>
+            <w:tcW w:w="1843" w:type="dxa"/>
+          </w:tcPr>
+          <w:p>
+            <w:pPr>
+              <w:ind w:firstLine="0"/>
+              <w:jc w:val="both"/>
+            </w:pPr>
+            <w:r>
+              <w:t>Vermelho</w:t>
+            </w:r>
+          </w:p>
+        </w:tc>
+        <w:tc>
+          <w:tcPr>
+            <w:tcW w:w="1701" w:type="dxa"/>
+          </w:tcPr>
+          <w:p>
+            <w:pPr>
+              <w:ind w:firstLine="0"/>
+              <w:jc w:val="both"/>
+            </w:pPr>
+            <w:r>
+              <w:t>1 segundo</w:t>
+            </w:r>
+          </w:p>
+        </w:tc>
+        <w:tc>
+          <w:tcPr>
+            <w:tcW w:w="3112" w:type="dxa"/>
+          </w:tcPr>
+          <w:p>
+            <w:pPr>
+              <w:ind w:firstLine="0"/>
+              <w:jc w:val="both"/>
+            </w:pPr>
+            <w:r>
+              <w:t>Intervalo de segurança antes de reiniciar</w:t>
+            </w:r>
+          </w:p>
+        </w:tc>
+      </w:tr>
+    </w:tbl>
+    <w:p>
+      <w:pPr>
+        <w:jc w:val="both"/>
+      </w:pPr>
+    </w:p>
+    <w:p>
+      <w:pPr>
+        <w:jc w:val="both"/>
+      </w:pPr>
     </w:p>
     <w:p>
       <w:pPr>
@@ -1565,13 +2284,13 @@
         <w:jc w:val="both"/>
       </w:pPr>
       <w:r>
-        <w:t>Descreva o que é requisito do sistema e dê exemplos sem identificar requisitos funcionais e não funcionais.</w:t>
-      </w:r>
-      <w:r>
-        <w:t xml:space="preserve"> </w:t>
-      </w:r>
-      <w:r>
-        <w:t>(lembre-se que o exemplo do notion pode estar superficial, a ideia é ajudar vocês a desenvolver a documentação, para finalizar, todo o texto é de forma discursiva e com suas palavras).</w:t>
+        <w:t xml:space="preserve">Requisitos do sistema são as necessidades que ele deve atender para funcionar corretamente, e no </w:t>
+      </w:r>
+      <w:r>
+        <w:t>Smart traffic</w:t>
+      </w:r>
+      <w:r>
+        <w:t xml:space="preserve"> ele precisa identificar o fluxo de carros, controlar os semáforos automaticamente, evitar que as duas vias fiquem abertas ao mesmo tempo, garantir segurança na troca de sinais e continuar funcionando mesmo se algum sensor falhar.</w:t>
       </w:r>
     </w:p>
     <w:p>
@@ -1619,22 +2338,362 @@
         <w:jc w:val="both"/>
       </w:pPr>
       <w:r>
-        <w:t xml:space="preserve">Descreva o que é requisitos funcionais (discursiva) de um sistema e utilize a tabela do notion (obrigatório), </w:t>
-      </w:r>
-      <w:r>
-        <w:t>faça as alterações que julgar necessário</w:t>
-      </w:r>
-      <w:r>
-        <w:t xml:space="preserve">. </w:t>
-      </w:r>
-      <w:r>
-        <w:t xml:space="preserve">(lembre-se </w:t>
-      </w:r>
-      <w:r>
-        <w:lastRenderedPageBreak/>
-        <w:t>que o exemplo do notion pode estar superficial, a ideia é ajudar vocês a desenvolver a documentação, para finalizar, todo o texto é de forma discursiva e com suas palavras).</w:t>
-      </w:r>
-    </w:p>
+        <w:t xml:space="preserve">Requisitos funcionais são as funções que o sistema precisa realizar para funcionar corretamente, e no </w:t>
+      </w:r>
+      <w:r>
+        <w:t>Smart traffic</w:t>
+      </w:r>
+      <w:r>
+        <w:t xml:space="preserve"> ele deve detectar os carros, analisar o fluxo de veículos, controlar automaticamente os semáforos, priorizar a via com mais movimento, garantir que nunca existam dois sinais verdes ao mesmo tempo e continuar funcionando mesmo quando houver falhas nos sensores.</w:t>
+      </w:r>
+    </w:p>
+    <w:tbl>
+      <w:tblPr>
+        <w:tblStyle w:val="Tabelacomgrade"/>
+        <w:tblW w:w="0" w:type="auto"/>
+        <w:tblLook w:val="04A0" w:firstRow="1" w:lastRow="0" w:firstColumn="1" w:lastColumn="0" w:noHBand="0" w:noVBand="1"/>
+      </w:tblPr>
+      <w:tblGrid>
+        <w:gridCol w:w="977"/>
+        <w:gridCol w:w="8084"/>
+      </w:tblGrid>
+      <w:tr>
+        <w:tc>
+          <w:tcPr>
+            <w:tcW w:w="846" w:type="dxa"/>
+          </w:tcPr>
+          <w:p>
+            <w:pPr>
+              <w:ind w:firstLine="0"/>
+              <w:jc w:val="both"/>
+            </w:pPr>
+            <w:r>
+              <w:t>Código</w:t>
+            </w:r>
+          </w:p>
+        </w:tc>
+        <w:tc>
+          <w:tcPr>
+            <w:tcW w:w="8215" w:type="dxa"/>
+          </w:tcPr>
+          <w:p>
+            <w:pPr>
+              <w:ind w:firstLine="0"/>
+              <w:jc w:val="both"/>
+            </w:pPr>
+            <w:r>
+              <w:t>Requisito funcional</w:t>
+            </w:r>
+          </w:p>
+        </w:tc>
+      </w:tr>
+      <w:tr>
+        <w:tc>
+          <w:tcPr>
+            <w:tcW w:w="846" w:type="dxa"/>
+          </w:tcPr>
+          <w:p>
+            <w:pPr>
+              <w:ind w:firstLine="0"/>
+              <w:jc w:val="both"/>
+            </w:pPr>
+            <w:r>
+              <w:t>RF01</w:t>
+            </w:r>
+          </w:p>
+        </w:tc>
+        <w:tc>
+          <w:tcPr>
+            <w:tcW w:w="8215" w:type="dxa"/>
+          </w:tcPr>
+          <w:p>
+            <w:pPr>
+              <w:spacing w:line="240" w:lineRule="auto"/>
+              <w:ind w:firstLine="0"/>
+              <w:jc w:val="both"/>
+              <w:rPr>
+                <w:rFonts w:ascii="Times New Roman" w:hAnsi="Times New Roman"/>
+              </w:rPr>
+            </w:pPr>
+            <w:r>
+              <w:t>O sistema deverá controlar o sinal verde da via principal.</w:t>
+            </w:r>
+          </w:p>
+        </w:tc>
+      </w:tr>
+      <w:tr>
+        <w:tc>
+          <w:tcPr>
+            <w:tcW w:w="846" w:type="dxa"/>
+          </w:tcPr>
+          <w:p>
+            <w:pPr>
+              <w:ind w:firstLine="0"/>
+              <w:jc w:val="both"/>
+            </w:pPr>
+            <w:r>
+              <w:t>RF02</w:t>
+            </w:r>
+          </w:p>
+        </w:tc>
+        <w:tc>
+          <w:tcPr>
+            <w:tcW w:w="8215" w:type="dxa"/>
+          </w:tcPr>
+          <w:p>
+            <w:pPr>
+              <w:spacing w:line="240" w:lineRule="auto"/>
+              <w:ind w:firstLine="0"/>
+              <w:jc w:val="both"/>
+              <w:rPr>
+                <w:rFonts w:ascii="Times New Roman" w:hAnsi="Times New Roman"/>
+              </w:rPr>
+            </w:pPr>
+            <w:r>
+              <w:t>O sistema deverá controlar o sinal amarelo da via principal.</w:t>
+            </w:r>
+          </w:p>
+        </w:tc>
+      </w:tr>
+      <w:tr>
+        <w:tc>
+          <w:tcPr>
+            <w:tcW w:w="846" w:type="dxa"/>
+          </w:tcPr>
+          <w:p>
+            <w:pPr>
+              <w:ind w:firstLine="0"/>
+              <w:jc w:val="both"/>
+            </w:pPr>
+            <w:r>
+              <w:t>RF03</w:t>
+            </w:r>
+          </w:p>
+        </w:tc>
+        <w:tc>
+          <w:tcPr>
+            <w:tcW w:w="8215" w:type="dxa"/>
+          </w:tcPr>
+          <w:p>
+            <w:pPr>
+              <w:spacing w:line="240" w:lineRule="auto"/>
+              <w:ind w:firstLine="0"/>
+              <w:jc w:val="both"/>
+              <w:rPr>
+                <w:rFonts w:ascii="Times New Roman" w:hAnsi="Times New Roman"/>
+              </w:rPr>
+            </w:pPr>
+            <w:r>
+              <w:t>O sistema deverá controlar o sinal vermelho da via principal.</w:t>
+            </w:r>
+          </w:p>
+        </w:tc>
+      </w:tr>
+      <w:tr>
+        <w:tc>
+          <w:tcPr>
+            <w:tcW w:w="846" w:type="dxa"/>
+          </w:tcPr>
+          <w:p>
+            <w:pPr>
+              <w:ind w:firstLine="0"/>
+              <w:jc w:val="both"/>
+            </w:pPr>
+            <w:r>
+              <w:t>RF04</w:t>
+            </w:r>
+          </w:p>
+        </w:tc>
+        <w:tc>
+          <w:tcPr>
+            <w:tcW w:w="8215" w:type="dxa"/>
+          </w:tcPr>
+          <w:p>
+            <w:pPr>
+              <w:spacing w:line="240" w:lineRule="auto"/>
+              <w:ind w:firstLine="0"/>
+              <w:jc w:val="both"/>
+              <w:rPr>
+                <w:rFonts w:ascii="Times New Roman" w:hAnsi="Times New Roman"/>
+              </w:rPr>
+            </w:pPr>
+            <w:r>
+              <w:t>O sistema deverá controlar o sinal verde da via secundária.</w:t>
+            </w:r>
+          </w:p>
+        </w:tc>
+      </w:tr>
+      <w:tr>
+        <w:tc>
+          <w:tcPr>
+            <w:tcW w:w="846" w:type="dxa"/>
+          </w:tcPr>
+          <w:p>
+            <w:pPr>
+              <w:ind w:firstLine="0"/>
+              <w:jc w:val="both"/>
+            </w:pPr>
+            <w:r>
+              <w:t>RF05</w:t>
+            </w:r>
+          </w:p>
+        </w:tc>
+        <w:tc>
+          <w:tcPr>
+            <w:tcW w:w="8215" w:type="dxa"/>
+          </w:tcPr>
+          <w:p>
+            <w:pPr>
+              <w:spacing w:line="240" w:lineRule="auto"/>
+              <w:ind w:firstLine="0"/>
+              <w:jc w:val="both"/>
+              <w:rPr>
+                <w:rFonts w:ascii="Times New Roman" w:hAnsi="Times New Roman"/>
+              </w:rPr>
+            </w:pPr>
+            <w:r>
+              <w:t>O sistema deverá controlar o sinal amarelo da via secundária.</w:t>
+            </w:r>
+          </w:p>
+        </w:tc>
+      </w:tr>
+      <w:tr>
+        <w:tc>
+          <w:tcPr>
+            <w:tcW w:w="846" w:type="dxa"/>
+          </w:tcPr>
+          <w:p>
+            <w:pPr>
+              <w:ind w:firstLine="0"/>
+              <w:jc w:val="both"/>
+            </w:pPr>
+            <w:r>
+              <w:t>RF06</w:t>
+            </w:r>
+          </w:p>
+        </w:tc>
+        <w:tc>
+          <w:tcPr>
+            <w:tcW w:w="8215" w:type="dxa"/>
+          </w:tcPr>
+          <w:p>
+            <w:pPr>
+              <w:spacing w:line="240" w:lineRule="auto"/>
+              <w:ind w:firstLine="0"/>
+              <w:jc w:val="both"/>
+              <w:rPr>
+                <w:rFonts w:ascii="Times New Roman" w:hAnsi="Times New Roman"/>
+              </w:rPr>
+            </w:pPr>
+            <w:r>
+              <w:t>O sistema deverá controlar o sinal vermelho da via secundária.</w:t>
+            </w:r>
+          </w:p>
+        </w:tc>
+      </w:tr>
+      <w:tr>
+        <w:tc>
+          <w:tcPr>
+            <w:tcW w:w="846" w:type="dxa"/>
+          </w:tcPr>
+          <w:p>
+            <w:pPr>
+              <w:ind w:firstLine="0"/>
+              <w:jc w:val="both"/>
+            </w:pPr>
+            <w:r>
+              <w:t>RF07</w:t>
+            </w:r>
+          </w:p>
+        </w:tc>
+        <w:tc>
+          <w:tcPr>
+            <w:tcW w:w="8215" w:type="dxa"/>
+          </w:tcPr>
+          <w:p>
+            <w:pPr>
+              <w:spacing w:line="240" w:lineRule="auto"/>
+              <w:ind w:firstLine="0"/>
+              <w:jc w:val="both"/>
+              <w:rPr>
+                <w:rFonts w:ascii="Times New Roman" w:hAnsi="Times New Roman"/>
+              </w:rPr>
+            </w:pPr>
+            <w:r>
+              <w:t>O sistema deverá impedir que as duas vias fiquem verdes ao mesmo tempo.</w:t>
+            </w:r>
+          </w:p>
+        </w:tc>
+      </w:tr>
+      <w:tr>
+        <w:tc>
+          <w:tcPr>
+            <w:tcW w:w="846" w:type="dxa"/>
+          </w:tcPr>
+          <w:p>
+            <w:pPr>
+              <w:ind w:firstLine="0"/>
+              <w:jc w:val="both"/>
+            </w:pPr>
+            <w:r>
+              <w:t>RF08</w:t>
+            </w:r>
+          </w:p>
+        </w:tc>
+        <w:tc>
+          <w:tcPr>
+            <w:tcW w:w="8215" w:type="dxa"/>
+          </w:tcPr>
+          <w:p>
+            <w:pPr>
+              <w:spacing w:line="240" w:lineRule="auto"/>
+              <w:ind w:firstLine="0"/>
+              <w:jc w:val="both"/>
+              <w:rPr>
+                <w:rFonts w:ascii="Times New Roman" w:hAnsi="Times New Roman"/>
+              </w:rPr>
+            </w:pPr>
+            <w:r>
+              <w:t xml:space="preserve">O sistema deverá repetir o ciclo do semáforo. </w:t>
+            </w:r>
+          </w:p>
+        </w:tc>
+      </w:tr>
+      <w:tr>
+        <w:tc>
+          <w:tcPr>
+            <w:tcW w:w="846" w:type="dxa"/>
+          </w:tcPr>
+          <w:p>
+            <w:pPr>
+              <w:ind w:firstLine="0"/>
+              <w:jc w:val="both"/>
+            </w:pPr>
+            <w:r>
+              <w:t>RF09</w:t>
+            </w:r>
+          </w:p>
+        </w:tc>
+        <w:tc>
+          <w:tcPr>
+            <w:tcW w:w="8215" w:type="dxa"/>
+          </w:tcPr>
+          <w:p>
+            <w:pPr>
+              <w:spacing w:line="240" w:lineRule="auto"/>
+              <w:ind w:firstLine="0"/>
+              <w:jc w:val="both"/>
+              <w:rPr>
+                <w:rFonts w:ascii="Times New Roman" w:hAnsi="Times New Roman"/>
+              </w:rPr>
+            </w:pPr>
+            <w:r>
+              <w:t>O sistema deverá exibir o estado atual dos semáforos no terminal.</w:t>
+            </w:r>
+          </w:p>
+        </w:tc>
+      </w:tr>
+    </w:tbl>
     <w:p>
       <w:pPr>
         <w:jc w:val="both"/>
@@ -1670,69 +2729,685 @@
     </w:p>
     <w:p>
       <w:pPr>
-        <w:jc w:val="both"/>
-      </w:pPr>
-      <w:r>
-        <w:t xml:space="preserve">Descreva o que é </w:t>
-      </w:r>
-      <w:r>
-        <w:t>requisito não</w:t>
-      </w:r>
-      <w:r>
-        <w:t xml:space="preserve"> funcionais</w:t>
-      </w:r>
-      <w:r>
-        <w:t xml:space="preserve"> (discursiva)</w:t>
-      </w:r>
-      <w:r>
-        <w:t xml:space="preserve"> de um sistema e utilize a tabela do notion (obrigatório)</w:t>
-      </w:r>
-      <w:r>
-        <w:t xml:space="preserve">, </w:t>
-      </w:r>
-      <w:r>
-        <w:t>faça as alterações que julgar necessário. (lembre-se que o exemplo do notion pode estar superficial, a ideia é ajudar vocês a desenvolver a documentação, para finalizar, todo o texto é de forma discursiva e com suas palavras).</w:t>
-      </w:r>
-    </w:p>
-    <w:p>
-      <w:pPr>
-        <w:ind w:firstLine="0"/>
-        <w:jc w:val="both"/>
-      </w:pPr>
-    </w:p>
-    <w:p>
-      <w:pPr>
-        <w:ind w:firstLine="0"/>
-        <w:jc w:val="both"/>
-      </w:pPr>
-    </w:p>
-    <w:p>
-      <w:pPr>
-        <w:ind w:firstLine="0"/>
-        <w:jc w:val="both"/>
-        <w:rPr>
-          <w:b/>
-          <w:bCs/>
-        </w:rPr>
-      </w:pPr>
-      <w:r>
-        <w:rPr>
-          <w:b/>
-          <w:bCs/>
-        </w:rPr>
-        <w:t>3.LISTA DE MATÉRIAIS E EQUIPAMENTOS</w:t>
-      </w:r>
-    </w:p>
-    <w:p>
-      <w:pPr>
-        <w:jc w:val="both"/>
-      </w:pPr>
-      <w:r>
-        <w:t xml:space="preserve">Faça um paragrafo para descrever a lista de matérias, uso da tabela no notion obrigatório, faça as alterações que julgar necessário, </w:t>
-      </w:r>
-      <w:r>
-        <w:t>(lembre-se que o exemplo do notion pode estar superficial, a ideia é ajudar vocês a desenvolver a documentação, para finalizar, todo o texto é de forma discursiva e com suas palavras).</w:t>
-      </w:r>
+        <w:ind w:firstLine="0"/>
+        <w:jc w:val="both"/>
+      </w:pPr>
+      <w:r>
+        <w:lastRenderedPageBreak/>
+        <w:t xml:space="preserve">Requisitos não funcionais são as qualidades que o sistema precisa ter para funcionar bem, e no </w:t>
+      </w:r>
+      <w:r>
+        <w:t>Smart traffic</w:t>
+      </w:r>
+      <w:r>
+        <w:t xml:space="preserve"> ele deve ser rápido, seguro e confiável no controle do trânsito, continuar funcionando mesmo quando houver falhas, não parar com facilidade e ainda usar os recursos de forma eficiente para não sobrecarregar o sistema.</w:t>
+      </w:r>
+    </w:p>
+    <w:tbl>
+      <w:tblPr>
+        <w:tblStyle w:val="Tabelacomgrade"/>
+        <w:tblW w:w="0" w:type="auto"/>
+        <w:tblLook w:val="04A0" w:firstRow="1" w:lastRow="0" w:firstColumn="1" w:lastColumn="0" w:noHBand="0" w:noVBand="1"/>
+      </w:tblPr>
+      <w:tblGrid>
+        <w:gridCol w:w="988"/>
+        <w:gridCol w:w="8073"/>
+      </w:tblGrid>
+      <w:tr>
+        <w:tc>
+          <w:tcPr>
+            <w:tcW w:w="988" w:type="dxa"/>
+          </w:tcPr>
+          <w:p>
+            <w:pPr>
+              <w:ind w:firstLine="0"/>
+              <w:jc w:val="both"/>
+            </w:pPr>
+            <w:r>
+              <w:t>Código</w:t>
+            </w:r>
+          </w:p>
+        </w:tc>
+        <w:tc>
+          <w:tcPr>
+            <w:tcW w:w="8073" w:type="dxa"/>
+          </w:tcPr>
+          <w:p>
+            <w:pPr>
+              <w:ind w:firstLine="0"/>
+              <w:jc w:val="both"/>
+            </w:pPr>
+            <w:r>
+              <w:t xml:space="preserve">Requisitos não funcionais </w:t>
+            </w:r>
+          </w:p>
+        </w:tc>
+      </w:tr>
+      <w:tr>
+        <w:tc>
+          <w:tcPr>
+            <w:tcW w:w="988" w:type="dxa"/>
+          </w:tcPr>
+          <w:p>
+            <w:pPr>
+              <w:ind w:firstLine="0"/>
+              <w:jc w:val="both"/>
+            </w:pPr>
+            <w:r>
+              <w:t>RNF01</w:t>
+            </w:r>
+          </w:p>
+        </w:tc>
+        <w:tc>
+          <w:tcPr>
+            <w:tcW w:w="8073" w:type="dxa"/>
+          </w:tcPr>
+          <w:p>
+            <w:pPr>
+              <w:spacing w:line="240" w:lineRule="auto"/>
+              <w:ind w:firstLine="0"/>
+              <w:jc w:val="both"/>
+              <w:rPr>
+                <w:rFonts w:ascii="Times New Roman" w:hAnsi="Times New Roman"/>
+              </w:rPr>
+            </w:pPr>
+            <w:r>
+              <w:t>O sistema deverá ser desenvolvido em linguagem C.</w:t>
+            </w:r>
+          </w:p>
+        </w:tc>
+      </w:tr>
+      <w:tr>
+        <w:tc>
+          <w:tcPr>
+            <w:tcW w:w="988" w:type="dxa"/>
+          </w:tcPr>
+          <w:p>
+            <w:pPr>
+              <w:ind w:firstLine="0"/>
+              <w:jc w:val="both"/>
+            </w:pPr>
+            <w:r>
+              <w:t>RNF02</w:t>
+            </w:r>
+          </w:p>
+        </w:tc>
+        <w:tc>
+          <w:tcPr>
+            <w:tcW w:w="8073" w:type="dxa"/>
+          </w:tcPr>
+          <w:p>
+            <w:pPr>
+              <w:spacing w:line="240" w:lineRule="auto"/>
+              <w:ind w:firstLine="0"/>
+              <w:jc w:val="both"/>
+              <w:rPr>
+                <w:rFonts w:ascii="Times New Roman" w:hAnsi="Times New Roman"/>
+              </w:rPr>
+            </w:pPr>
+            <w:r>
+              <w:t>O código deverá ser desenvolvido com nomes de variáveis compreensíveis.</w:t>
+            </w:r>
+          </w:p>
+        </w:tc>
+      </w:tr>
+      <w:tr>
+        <w:tc>
+          <w:tcPr>
+            <w:tcW w:w="988" w:type="dxa"/>
+          </w:tcPr>
+          <w:p>
+            <w:pPr>
+              <w:ind w:firstLine="0"/>
+              <w:jc w:val="both"/>
+            </w:pPr>
+            <w:r>
+              <w:t>RNF03</w:t>
+            </w:r>
+          </w:p>
+        </w:tc>
+        <w:tc>
+          <w:tcPr>
+            <w:tcW w:w="8073" w:type="dxa"/>
+          </w:tcPr>
+          <w:p>
+            <w:pPr>
+              <w:spacing w:line="240" w:lineRule="auto"/>
+              <w:ind w:firstLine="0"/>
+              <w:jc w:val="both"/>
+              <w:rPr>
+                <w:rFonts w:ascii="Times New Roman" w:hAnsi="Times New Roman"/>
+              </w:rPr>
+            </w:pPr>
+            <w:r>
+              <w:t>O programa deverá ser executado em ambiente Windows ou Linux.</w:t>
+            </w:r>
+          </w:p>
+        </w:tc>
+      </w:tr>
+      <w:tr>
+        <w:tc>
+          <w:tcPr>
+            <w:tcW w:w="988" w:type="dxa"/>
+          </w:tcPr>
+          <w:p>
+            <w:pPr>
+              <w:ind w:firstLine="0"/>
+              <w:jc w:val="both"/>
+            </w:pPr>
+            <w:r>
+              <w:t>RNF04</w:t>
+            </w:r>
+          </w:p>
+        </w:tc>
+        <w:tc>
+          <w:tcPr>
+            <w:tcW w:w="8073" w:type="dxa"/>
+          </w:tcPr>
+          <w:p>
+            <w:pPr>
+              <w:spacing w:line="240" w:lineRule="auto"/>
+              <w:ind w:firstLine="0"/>
+              <w:jc w:val="both"/>
+              <w:rPr>
+                <w:rFonts w:ascii="Times New Roman" w:hAnsi="Times New Roman"/>
+              </w:rPr>
+            </w:pPr>
+            <w:r>
+              <w:t>O código deverá ser organizado para facilitar manutenção.</w:t>
+            </w:r>
+          </w:p>
+        </w:tc>
+      </w:tr>
+      <w:tr>
+        <w:tc>
+          <w:tcPr>
+            <w:tcW w:w="988" w:type="dxa"/>
+          </w:tcPr>
+          <w:p>
+            <w:pPr>
+              <w:ind w:firstLine="0"/>
+              <w:jc w:val="both"/>
+            </w:pPr>
+            <w:r>
+              <w:t>RNF05</w:t>
+            </w:r>
+          </w:p>
+        </w:tc>
+        <w:tc>
+          <w:tcPr>
+            <w:tcW w:w="8073" w:type="dxa"/>
+          </w:tcPr>
+          <w:p>
+            <w:pPr>
+              <w:spacing w:line="240" w:lineRule="auto"/>
+              <w:ind w:firstLine="0"/>
+              <w:jc w:val="both"/>
+              <w:rPr>
+                <w:rFonts w:ascii="Times New Roman" w:hAnsi="Times New Roman"/>
+              </w:rPr>
+            </w:pPr>
+            <w:r>
+              <w:t>O sistema deverá apresentar mensagens claras no terminal.</w:t>
+            </w:r>
+          </w:p>
+        </w:tc>
+      </w:tr>
+    </w:tbl>
+    <w:p>
+      <w:pPr>
+        <w:ind w:firstLine="0"/>
+        <w:jc w:val="both"/>
+      </w:pPr>
+    </w:p>
+    <w:p>
+      <w:pPr>
+        <w:ind w:firstLine="0"/>
+        <w:jc w:val="both"/>
+      </w:pPr>
+    </w:p>
+    <w:p>
+      <w:pPr>
+        <w:ind w:firstLine="0"/>
+        <w:jc w:val="both"/>
+        <w:rPr>
+          <w:b/>
+          <w:bCs/>
+        </w:rPr>
+      </w:pPr>
+      <w:r>
+        <w:rPr>
+          <w:b/>
+          <w:bCs/>
+        </w:rPr>
+        <w:t>3.LISTA DE MAT</w:t>
+      </w:r>
+      <w:r>
+        <w:rPr>
+          <w:b/>
+          <w:bCs/>
+        </w:rPr>
+        <w:t>E</w:t>
+      </w:r>
+      <w:r>
+        <w:rPr>
+          <w:b/>
+          <w:bCs/>
+        </w:rPr>
+        <w:t>RIAIS E EQUIPAMENTOS</w:t>
+      </w:r>
+    </w:p>
+    <w:tbl>
+      <w:tblPr>
+        <w:tblStyle w:val="Tabelacomgrade"/>
+        <w:tblW w:w="0" w:type="auto"/>
+        <w:tblLook w:val="04A0" w:firstRow="1" w:lastRow="0" w:firstColumn="1" w:lastColumn="0" w:noHBand="0" w:noVBand="1"/>
+      </w:tblPr>
+      <w:tblGrid>
+        <w:gridCol w:w="2972"/>
+        <w:gridCol w:w="6089"/>
+      </w:tblGrid>
+      <w:tr>
+        <w:tc>
+          <w:tcPr>
+            <w:tcW w:w="2972" w:type="dxa"/>
+            <w:hideMark/>
+          </w:tcPr>
+          <w:p>
+            <w:pPr>
+              <w:jc w:val="both"/>
+              <w:rPr>
+                <w:b/>
+                <w:bCs/>
+              </w:rPr>
+            </w:pPr>
+            <w:r>
+              <w:rPr>
+                <w:b/>
+                <w:bCs/>
+              </w:rPr>
+              <w:t>Item</w:t>
+            </w:r>
+          </w:p>
+        </w:tc>
+        <w:tc>
+          <w:tcPr>
+            <w:tcW w:w="6089" w:type="dxa"/>
+            <w:hideMark/>
+          </w:tcPr>
+          <w:p>
+            <w:pPr>
+              <w:jc w:val="both"/>
+              <w:rPr>
+                <w:b/>
+                <w:bCs/>
+              </w:rPr>
+            </w:pPr>
+            <w:r>
+              <w:rPr>
+                <w:b/>
+                <w:bCs/>
+              </w:rPr>
+              <w:t>Finalidade</w:t>
+            </w:r>
+          </w:p>
+        </w:tc>
+      </w:tr>
+      <w:tr>
+        <w:tc>
+          <w:tcPr>
+            <w:tcW w:w="2972" w:type="dxa"/>
+            <w:hideMark/>
+          </w:tcPr>
+          <w:p>
+            <w:pPr>
+              <w:ind w:firstLine="0"/>
+              <w:jc w:val="both"/>
+            </w:pPr>
+            <w:r>
+              <w:t>Computador ou notebook</w:t>
+            </w:r>
+          </w:p>
+        </w:tc>
+        <w:tc>
+          <w:tcPr>
+            <w:tcW w:w="6089" w:type="dxa"/>
+            <w:hideMark/>
+          </w:tcPr>
+          <w:p>
+            <w:pPr>
+              <w:ind w:firstLine="0"/>
+              <w:jc w:val="both"/>
+            </w:pPr>
+            <w:r>
+              <w:t>Desenvolver e testar o programa</w:t>
+            </w:r>
+            <w:r>
+              <w:t>.</w:t>
+            </w:r>
+          </w:p>
+        </w:tc>
+      </w:tr>
+      <w:tr>
+        <w:tc>
+          <w:tcPr>
+            <w:tcW w:w="2972" w:type="dxa"/>
+            <w:hideMark/>
+          </w:tcPr>
+          <w:p>
+            <w:pPr>
+              <w:ind w:firstLine="0"/>
+              <w:jc w:val="both"/>
+            </w:pPr>
+            <w:r>
+              <w:t>Visual Studio Code</w:t>
+            </w:r>
+          </w:p>
+        </w:tc>
+        <w:tc>
+          <w:tcPr>
+            <w:tcW w:w="6089" w:type="dxa"/>
+            <w:hideMark/>
+          </w:tcPr>
+          <w:p>
+            <w:pPr>
+              <w:ind w:firstLine="0"/>
+              <w:jc w:val="both"/>
+            </w:pPr>
+            <w:r>
+              <w:t>Escrever o código-fonte</w:t>
+            </w:r>
+            <w:r>
+              <w:t>.</w:t>
+            </w:r>
+          </w:p>
+        </w:tc>
+      </w:tr>
+      <w:tr>
+        <w:tc>
+          <w:tcPr>
+            <w:tcW w:w="2972" w:type="dxa"/>
+            <w:hideMark/>
+          </w:tcPr>
+          <w:p>
+            <w:pPr>
+              <w:ind w:firstLine="0"/>
+              <w:jc w:val="both"/>
+            </w:pPr>
+            <w:r>
+              <w:t>Compilador GCC</w:t>
+            </w:r>
+          </w:p>
+        </w:tc>
+        <w:tc>
+          <w:tcPr>
+            <w:tcW w:w="6089" w:type="dxa"/>
+            <w:hideMark/>
+          </w:tcPr>
+          <w:p>
+            <w:pPr>
+              <w:ind w:firstLine="0"/>
+              <w:jc w:val="both"/>
+            </w:pPr>
+            <w:r>
+              <w:t>Compilar o programa em linguagem C</w:t>
+            </w:r>
+            <w:r>
+              <w:t>.</w:t>
+            </w:r>
+          </w:p>
+        </w:tc>
+      </w:tr>
+      <w:tr>
+        <w:tc>
+          <w:tcPr>
+            <w:tcW w:w="2972" w:type="dxa"/>
+            <w:hideMark/>
+          </w:tcPr>
+          <w:p>
+            <w:pPr>
+              <w:ind w:firstLine="0"/>
+              <w:jc w:val="both"/>
+            </w:pPr>
+            <w:r>
+              <w:t>Git</w:t>
+            </w:r>
+          </w:p>
+        </w:tc>
+        <w:tc>
+          <w:tcPr>
+            <w:tcW w:w="6089" w:type="dxa"/>
+            <w:hideMark/>
+          </w:tcPr>
+          <w:p>
+            <w:pPr>
+              <w:ind w:firstLine="0"/>
+              <w:jc w:val="both"/>
+            </w:pPr>
+            <w:r>
+              <w:t>Controlar as versões do projeto</w:t>
+            </w:r>
+            <w:r>
+              <w:t>.</w:t>
+            </w:r>
+          </w:p>
+        </w:tc>
+      </w:tr>
+      <w:tr>
+        <w:tc>
+          <w:tcPr>
+            <w:tcW w:w="2972" w:type="dxa"/>
+            <w:hideMark/>
+          </w:tcPr>
+          <w:p>
+            <w:pPr>
+              <w:ind w:firstLine="0"/>
+              <w:jc w:val="both"/>
+            </w:pPr>
+            <w:r>
+              <w:t>GitHub</w:t>
+            </w:r>
+          </w:p>
+        </w:tc>
+        <w:tc>
+          <w:tcPr>
+            <w:tcW w:w="6089" w:type="dxa"/>
+            <w:hideMark/>
+          </w:tcPr>
+          <w:p>
+            <w:pPr>
+              <w:ind w:firstLine="0"/>
+              <w:jc w:val="both"/>
+            </w:pPr>
+            <w:r>
+              <w:t>Armazenar o projeto em repositório remoto</w:t>
+            </w:r>
+            <w:r>
+              <w:t>.</w:t>
+            </w:r>
+          </w:p>
+        </w:tc>
+      </w:tr>
+      <w:tr>
+        <w:tc>
+          <w:tcPr>
+            <w:tcW w:w="2972" w:type="dxa"/>
+            <w:hideMark/>
+          </w:tcPr>
+          <w:p>
+            <w:pPr>
+              <w:ind w:firstLine="0"/>
+              <w:jc w:val="both"/>
+            </w:pPr>
+            <w:r>
+              <w:t>Sistema operacional Windows ou Linux</w:t>
+            </w:r>
+          </w:p>
+        </w:tc>
+        <w:tc>
+          <w:tcPr>
+            <w:tcW w:w="6089" w:type="dxa"/>
+            <w:hideMark/>
+          </w:tcPr>
+          <w:p>
+            <w:pPr>
+              <w:ind w:firstLine="0"/>
+              <w:jc w:val="both"/>
+            </w:pPr>
+            <w:r>
+              <w:t>Ambiente de desenvolvimento</w:t>
+            </w:r>
+            <w:r>
+              <w:t>.</w:t>
+            </w:r>
+          </w:p>
+        </w:tc>
+      </w:tr>
+      <w:tr>
+        <w:tc>
+          <w:tcPr>
+            <w:tcW w:w="2972" w:type="dxa"/>
+            <w:hideMark/>
+          </w:tcPr>
+          <w:p>
+            <w:pPr>
+              <w:ind w:firstLine="0"/>
+              <w:jc w:val="both"/>
+            </w:pPr>
+            <w:r>
+              <w:t>Arduino ou ESP32</w:t>
+            </w:r>
+          </w:p>
+        </w:tc>
+        <w:tc>
+          <w:tcPr>
+            <w:tcW w:w="6089" w:type="dxa"/>
+            <w:hideMark/>
+          </w:tcPr>
+          <w:p>
+            <w:pPr>
+              <w:ind w:firstLine="0"/>
+              <w:jc w:val="both"/>
+            </w:pPr>
+            <w:r>
+              <w:t>Opcional para protótipo físico</w:t>
+            </w:r>
+            <w:r>
+              <w:t>.</w:t>
+            </w:r>
+          </w:p>
+        </w:tc>
+      </w:tr>
+      <w:tr>
+        <w:tc>
+          <w:tcPr>
+            <w:tcW w:w="2972" w:type="dxa"/>
+            <w:hideMark/>
+          </w:tcPr>
+          <w:p>
+            <w:pPr>
+              <w:ind w:firstLine="0"/>
+              <w:jc w:val="both"/>
+            </w:pPr>
+            <w:r>
+              <w:t>LEDs vermelho, amarelo e verde</w:t>
+            </w:r>
+          </w:p>
+        </w:tc>
+        <w:tc>
+          <w:tcPr>
+            <w:tcW w:w="6089" w:type="dxa"/>
+            <w:hideMark/>
+          </w:tcPr>
+          <w:p>
+            <w:pPr>
+              <w:ind w:firstLine="0"/>
+              <w:jc w:val="both"/>
+            </w:pPr>
+            <w:r>
+              <w:t>Opcional para representar as luzes do semáforo</w:t>
+            </w:r>
+            <w:r>
+              <w:t>.</w:t>
+            </w:r>
+          </w:p>
+        </w:tc>
+      </w:tr>
+      <w:tr>
+        <w:tc>
+          <w:tcPr>
+            <w:tcW w:w="2972" w:type="dxa"/>
+            <w:hideMark/>
+          </w:tcPr>
+          <w:p>
+            <w:pPr>
+              <w:ind w:firstLine="0"/>
+              <w:jc w:val="both"/>
+            </w:pPr>
+            <w:r>
+              <w:t>Resistores</w:t>
+            </w:r>
+          </w:p>
+        </w:tc>
+        <w:tc>
+          <w:tcPr>
+            <w:tcW w:w="6089" w:type="dxa"/>
+            <w:hideMark/>
+          </w:tcPr>
+          <w:p>
+            <w:pPr>
+              <w:ind w:firstLine="0"/>
+              <w:jc w:val="both"/>
+            </w:pPr>
+            <w:r>
+              <w:t>Opcional para proteger os LEDs</w:t>
+            </w:r>
+            <w:r>
+              <w:t>.</w:t>
+            </w:r>
+          </w:p>
+        </w:tc>
+      </w:tr>
+      <w:tr>
+        <w:tc>
+          <w:tcPr>
+            <w:tcW w:w="2972" w:type="dxa"/>
+            <w:hideMark/>
+          </w:tcPr>
+          <w:p>
+            <w:pPr>
+              <w:ind w:firstLine="0"/>
+              <w:jc w:val="both"/>
+            </w:pPr>
+            <w:r>
+              <w:t>Protoboard e jumpers</w:t>
+            </w:r>
+          </w:p>
+        </w:tc>
+        <w:tc>
+          <w:tcPr>
+            <w:tcW w:w="6089" w:type="dxa"/>
+            <w:hideMark/>
+          </w:tcPr>
+          <w:p>
+            <w:pPr>
+              <w:ind w:firstLine="0"/>
+              <w:jc w:val="both"/>
+            </w:pPr>
+            <w:r>
+              <w:t>Opcional para montagem física do circuito</w:t>
+            </w:r>
+            <w:r>
+              <w:t>.</w:t>
+            </w:r>
+          </w:p>
+        </w:tc>
+      </w:tr>
+    </w:tbl>
+    <w:p>
+      <w:pPr>
+        <w:jc w:val="both"/>
+      </w:pPr>
     </w:p>
     <w:p>
       <w:pPr>
@@ -1762,17 +3437,17 @@
         <w:jc w:val="both"/>
       </w:pPr>
       <w:r>
-        <w:t xml:space="preserve">Justifique o uso da linguagem de programação utilizada no projeto, pode se pesquisar na web seguindo o padrão de usar algum artigo e </w:t>
-      </w:r>
-      <w:r>
-        <w:t>IA, comparar</w:t>
-      </w:r>
-      <w:r>
-        <w:t xml:space="preserve"> e fazer com suas palavras. </w:t>
-      </w:r>
-      <w:r>
-        <w:t>(lembre-se que o exemplo do notion pode estar superficial, a ideia é ajudar vocês a desenvolver a documentação, para finalizar, todo o texto é de forma discursiva e com suas palavras).</w:t>
-      </w:r>
+        <w:t xml:space="preserve">No projeto Smart Traffic foi utilizada a linguagem C porque ela é eficiente para sistemas embarcados, como o controle de semáforos inteligentes, permitindo um controle direto do hardware como sensores e LEDs com respostas rápidas, além de ser compatível com o Arduino que será usado no projeto, consumir poucos recursos </w:t>
+      </w:r>
+      <w:r>
+        <w:lastRenderedPageBreak/>
+        <w:t>e funcionar bem em tempo real, o que torna o sistema mais estável, preciso e confiável.</w:t>
+      </w:r>
+    </w:p>
+    <w:p>
+      <w:pPr>
+        <w:jc w:val="both"/>
+      </w:pPr>
     </w:p>
     <w:p>
       <w:pPr>
@@ -1799,103 +3474,581 @@
     </w:p>
     <w:p>
       <w:pPr>
-        <w:jc w:val="both"/>
-      </w:pPr>
-      <w:r>
-        <w:t xml:space="preserve">Justifique o uso </w:t>
-      </w:r>
-      <w:r>
-        <w:t>do sistema operacional</w:t>
-      </w:r>
-      <w:r>
-        <w:t xml:space="preserve"> utilizad</w:t>
+        <w:ind w:firstLine="0"/>
+        <w:jc w:val="both"/>
+      </w:pPr>
+      <w:r>
+        <w:t xml:space="preserve">No projeto Smart Traffic foi usado o sistema operacional Windows porque ele é o mais utilizado no mundo, o que facilita encontrar ajuda e ferramentas, além de ser compatível com </w:t>
       </w:r>
       <w:r>
         <w:t>o</w:t>
       </w:r>
       <w:r>
-        <w:t xml:space="preserve"> no projeto</w:t>
-      </w:r>
-      <w:r>
-        <w:t xml:space="preserve"> (pode pesquisar o fato dele ser mais utilizado no mundo e usar isso como argumento)</w:t>
-      </w:r>
-      <w:r>
-        <w:t>, pode se pesquisar na web seguindo o padrão de usar algum artigo e IA, comparar e fazer com suas palavras. (lembre-se que o exemplo do notion pode estar superficial, a ideia é ajudar vocês a desenvolver a documentação, para finalizar, todo o texto é de forma discursiva e com suas palavras).</w:t>
-      </w:r>
-    </w:p>
-    <w:p>
-      <w:pPr>
-        <w:ind w:firstLine="0"/>
-        <w:jc w:val="both"/>
-      </w:pPr>
-    </w:p>
-    <w:p>
-      <w:pPr>
-        <w:ind w:firstLine="0"/>
-        <w:jc w:val="both"/>
-      </w:pPr>
-    </w:p>
-    <w:p>
-      <w:pPr>
-        <w:ind w:firstLine="0"/>
-        <w:jc w:val="both"/>
-        <w:rPr>
-          <w:b/>
-          <w:bCs/>
-        </w:rPr>
-      </w:pPr>
-      <w:r>
-        <w:rPr>
-          <w:b/>
-          <w:bCs/>
-        </w:rPr>
+        <w:t xml:space="preserve"> Arduino e outros programas usados no projeto, ter uma interface fácil de usar, ajudar no desenvolvimento mesmo para iniciantes e oferecer mais softwares e suporte em comparação com outros sistemas, tornando o trabalho mais prático e eficiente.</w:t>
+      </w:r>
+    </w:p>
+    <w:p>
+      <w:pPr>
+        <w:ind w:firstLine="0"/>
+        <w:jc w:val="both"/>
+      </w:pPr>
+    </w:p>
+    <w:p>
+      <w:pPr>
+        <w:ind w:firstLine="0"/>
+        <w:jc w:val="both"/>
+      </w:pPr>
+    </w:p>
+    <w:p>
+      <w:pPr>
+        <w:ind w:firstLine="0"/>
+        <w:jc w:val="both"/>
+        <w:rPr>
+          <w:b/>
+          <w:bCs/>
+        </w:rPr>
+      </w:pPr>
+      <w:r>
+        <w:rPr>
+          <w:b/>
+          <w:bCs/>
+        </w:rPr>
+        <w:t>6.CRONOGRAMA DO PROJETO</w:t>
+      </w:r>
+    </w:p>
+    <w:p>
+      <w:pPr>
+        <w:ind w:firstLine="0"/>
+        <w:jc w:val="both"/>
+      </w:pPr>
+      <w:r>
+        <w:t>O cronograma serve para organizar as etapas do projeto Smart Traffic e definir prazos para cada atividade, ajudando a acompanhar o progresso e evitando atrasos ou esquecimentos durante o desenvolvimento, além de facilitar a divisão das tarefas, melhorar a organização do trabalho e permitir visualizar todas as fases do projeto de forma clara, deixando o desenvolvimento mais eficiente e bem planejado.</w:t>
+      </w:r>
+    </w:p>
+    <w:tbl>
+      <w:tblPr>
+        <w:tblStyle w:val="Tabelacomgrade"/>
+        <w:tblW w:w="0" w:type="auto"/>
+        <w:tblLook w:val="04A0" w:firstRow="1" w:lastRow="0" w:firstColumn="1" w:lastColumn="0" w:noHBand="0" w:noVBand="1"/>
+      </w:tblPr>
+      <w:tblGrid>
+        <w:gridCol w:w="1311"/>
+        <w:gridCol w:w="6500"/>
+      </w:tblGrid>
+      <w:tr>
+        <w:tc>
+          <w:tcPr>
+            <w:tcW w:w="0" w:type="auto"/>
+            <w:hideMark/>
+          </w:tcPr>
+          <w:p>
+            <w:pPr>
+              <w:ind w:firstLine="0"/>
+              <w:jc w:val="both"/>
+              <w:rPr>
+                <w:b/>
+                <w:bCs/>
+              </w:rPr>
+            </w:pPr>
+            <w:r>
+              <w:rPr>
+                <w:b/>
+                <w:bCs/>
+              </w:rPr>
+              <w:t>Semana</w:t>
+            </w:r>
+          </w:p>
+        </w:tc>
+        <w:tc>
+          <w:tcPr>
+            <w:tcW w:w="0" w:type="auto"/>
+            <w:hideMark/>
+          </w:tcPr>
+          <w:p>
+            <w:pPr>
+              <w:ind w:firstLine="0"/>
+              <w:jc w:val="both"/>
+              <w:rPr>
+                <w:b/>
+                <w:bCs/>
+              </w:rPr>
+            </w:pPr>
+            <w:r>
+              <w:rPr>
+                <w:b/>
+                <w:bCs/>
+              </w:rPr>
+              <w:t>Atividade prevista</w:t>
+            </w:r>
+          </w:p>
+        </w:tc>
+      </w:tr>
+      <w:tr>
+        <w:tc>
+          <w:tcPr>
+            <w:tcW w:w="0" w:type="auto"/>
+            <w:hideMark/>
+          </w:tcPr>
+          <w:p>
+            <w:pPr>
+              <w:ind w:firstLine="0"/>
+              <w:jc w:val="both"/>
+            </w:pPr>
+            <w:r>
+              <w:t>Semana 1</w:t>
+            </w:r>
+          </w:p>
+        </w:tc>
+        <w:tc>
+          <w:tcPr>
+            <w:tcW w:w="0" w:type="auto"/>
+            <w:hideMark/>
+          </w:tcPr>
+          <w:p>
+            <w:pPr>
+              <w:ind w:firstLine="0"/>
+              <w:jc w:val="both"/>
+            </w:pPr>
+            <w:r>
+              <w:t>Entendimento do problema e análise da situação-problema</w:t>
+            </w:r>
+          </w:p>
+        </w:tc>
+      </w:tr>
+      <w:tr>
+        <w:tc>
+          <w:tcPr>
+            <w:tcW w:w="0" w:type="auto"/>
+            <w:hideMark/>
+          </w:tcPr>
+          <w:p>
+            <w:pPr>
+              <w:ind w:firstLine="0"/>
+              <w:jc w:val="both"/>
+            </w:pPr>
+            <w:r>
+              <w:t>Semana 2</w:t>
+            </w:r>
+          </w:p>
+        </w:tc>
+        <w:tc>
+          <w:tcPr>
+            <w:tcW w:w="0" w:type="auto"/>
+            <w:hideMark/>
+          </w:tcPr>
+          <w:p>
+            <w:pPr>
+              <w:ind w:firstLine="0"/>
+              <w:jc w:val="both"/>
+            </w:pPr>
+            <w:r>
+              <w:t>Elaboração da documentação da Sprint 1</w:t>
+            </w:r>
+          </w:p>
+        </w:tc>
+      </w:tr>
+      <w:tr>
+        <w:tc>
+          <w:tcPr>
+            <w:tcW w:w="0" w:type="auto"/>
+            <w:hideMark/>
+          </w:tcPr>
+          <w:p>
+            <w:pPr>
+              <w:ind w:firstLine="0"/>
+              <w:jc w:val="both"/>
+            </w:pPr>
+            <w:r>
+              <w:t>Semana 3</w:t>
+            </w:r>
+          </w:p>
+        </w:tc>
+        <w:tc>
+          <w:tcPr>
+            <w:tcW w:w="0" w:type="auto"/>
+            <w:hideMark/>
+          </w:tcPr>
+          <w:p>
+            <w:pPr>
+              <w:ind w:firstLine="0"/>
+              <w:jc w:val="both"/>
+            </w:pPr>
+            <w:r>
+              <w:t>Definição dos requisitos funcionais e não funcionais</w:t>
+            </w:r>
+          </w:p>
+        </w:tc>
+      </w:tr>
+      <w:tr>
+        <w:tc>
+          <w:tcPr>
+            <w:tcW w:w="0" w:type="auto"/>
+            <w:hideMark/>
+          </w:tcPr>
+          <w:p>
+            <w:pPr>
+              <w:ind w:firstLine="0"/>
+              <w:jc w:val="both"/>
+            </w:pPr>
+            <w:r>
+              <w:t>Semana 4</w:t>
+            </w:r>
+          </w:p>
+        </w:tc>
+        <w:tc>
+          <w:tcPr>
+            <w:tcW w:w="0" w:type="auto"/>
+            <w:hideMark/>
+          </w:tcPr>
+          <w:p>
+            <w:pPr>
+              <w:ind w:firstLine="0"/>
+              <w:jc w:val="both"/>
+            </w:pPr>
+            <w:r>
+              <w:t>Definição da linguagem, sistema operacional e materiais</w:t>
+            </w:r>
+          </w:p>
+        </w:tc>
+      </w:tr>
+      <w:tr>
+        <w:tc>
+          <w:tcPr>
+            <w:tcW w:w="0" w:type="auto"/>
+            <w:hideMark/>
+          </w:tcPr>
+          <w:p>
+            <w:pPr>
+              <w:ind w:firstLine="0"/>
+              <w:jc w:val="both"/>
+            </w:pPr>
+            <w:r>
+              <w:t>Semana 5</w:t>
+            </w:r>
+          </w:p>
+        </w:tc>
+        <w:tc>
+          <w:tcPr>
+            <w:tcW w:w="0" w:type="auto"/>
+            <w:hideMark/>
+          </w:tcPr>
+          <w:p>
+            <w:pPr>
+              <w:ind w:firstLine="0"/>
+              <w:jc w:val="both"/>
+            </w:pPr>
+            <w:r>
+              <w:t>Início da lógica do semáforo</w:t>
+            </w:r>
+          </w:p>
+        </w:tc>
+      </w:tr>
+      <w:tr>
+        <w:tc>
+          <w:tcPr>
+            <w:tcW w:w="0" w:type="auto"/>
+            <w:hideMark/>
+          </w:tcPr>
+          <w:p>
+            <w:pPr>
+              <w:ind w:firstLine="0"/>
+              <w:jc w:val="both"/>
+            </w:pPr>
+            <w:r>
+              <w:t>Semana 6</w:t>
+            </w:r>
+          </w:p>
+        </w:tc>
+        <w:tc>
+          <w:tcPr>
+            <w:tcW w:w="0" w:type="auto"/>
+            <w:hideMark/>
+          </w:tcPr>
+          <w:p>
+            <w:pPr>
+              <w:ind w:firstLine="0"/>
+              <w:jc w:val="both"/>
+            </w:pPr>
+            <w:r>
+              <w:t>Desenvolvimento do código em linguagem C</w:t>
+            </w:r>
+          </w:p>
+        </w:tc>
+      </w:tr>
+      <w:tr>
+        <w:tc>
+          <w:tcPr>
+            <w:tcW w:w="0" w:type="auto"/>
+            <w:hideMark/>
+          </w:tcPr>
+          <w:p>
+            <w:pPr>
+              <w:ind w:firstLine="0"/>
+              <w:jc w:val="both"/>
+            </w:pPr>
+            <w:r>
+              <w:t>Semana 7</w:t>
+            </w:r>
+          </w:p>
+        </w:tc>
+        <w:tc>
+          <w:tcPr>
+            <w:tcW w:w="0" w:type="auto"/>
+            <w:hideMark/>
+          </w:tcPr>
+          <w:p>
+            <w:pPr>
+              <w:ind w:firstLine="0"/>
+              <w:jc w:val="both"/>
+            </w:pPr>
+            <w:r>
+              <w:t>Testes e correções do programa</w:t>
+            </w:r>
+          </w:p>
+        </w:tc>
+      </w:tr>
+      <w:tr>
+        <w:tc>
+          <w:tcPr>
+            <w:tcW w:w="0" w:type="auto"/>
+            <w:hideMark/>
+          </w:tcPr>
+          <w:p>
+            <w:pPr>
+              <w:ind w:firstLine="0"/>
+              <w:jc w:val="both"/>
+            </w:pPr>
+            <w:r>
+              <w:t>Semana 8</w:t>
+            </w:r>
+          </w:p>
+        </w:tc>
+        <w:tc>
+          <w:tcPr>
+            <w:tcW w:w="0" w:type="auto"/>
+            <w:hideMark/>
+          </w:tcPr>
+          <w:p>
+            <w:pPr>
+              <w:ind w:firstLine="0"/>
+              <w:jc w:val="both"/>
+            </w:pPr>
+            <w:r>
+              <w:t>Organização do GitHub e apresentação da solução</w:t>
+            </w:r>
+          </w:p>
+        </w:tc>
+      </w:tr>
+    </w:tbl>
+    <w:p>
+      <w:pPr>
+        <w:ind w:firstLine="0"/>
+        <w:jc w:val="both"/>
+      </w:pPr>
+    </w:p>
+    <w:p>
+      <w:pPr>
+        <w:ind w:firstLine="0"/>
+        <w:jc w:val="both"/>
+        <w:rPr>
+          <w:b/>
+          <w:bCs/>
+        </w:rPr>
+      </w:pPr>
+      <w:r>
+        <w:rPr>
+          <w:b/>
+          <w:bCs/>
+        </w:rPr>
+        <w:t>7.REPOSITÓRIO GITHUB</w:t>
+      </w:r>
+    </w:p>
+    <w:p>
+      <w:pPr>
+        <w:ind w:firstLine="0"/>
+        <w:jc w:val="both"/>
+      </w:pPr>
+      <w:r>
+        <w:t xml:space="preserve">Git é uma ferramenta que controla e salva as versões do código, permitindo voltar atrás em caso de erros, enquanto o GitHub é uma plataforma online que armazena o </w:t>
+      </w:r>
+      <w:r>
         <w:lastRenderedPageBreak/>
-        <w:t>6.CRONOGRAMA DO PROJETO</w:t>
-      </w:r>
-    </w:p>
-    <w:p>
-      <w:pPr>
-        <w:jc w:val="both"/>
-      </w:pPr>
-      <w:r>
-        <w:t xml:space="preserve">Descreva o objetivo de um cronograma no projeto e justifique seu uso, utilizar a tabela do notion. </w:t>
-      </w:r>
-      <w:r>
-        <w:t>(lembre-se que o exemplo do notion pode estar superficial, a ideia é ajudar vocês a desenvolver a documentação, para finalizar, todo o texto é de forma discursiva e com suas palavras).</w:t>
-      </w:r>
-    </w:p>
-    <w:p>
-      <w:pPr>
-        <w:ind w:firstLine="0"/>
-        <w:jc w:val="both"/>
-      </w:pPr>
-    </w:p>
-    <w:p>
-      <w:pPr>
-        <w:ind w:firstLine="0"/>
-        <w:jc w:val="both"/>
-        <w:rPr>
-          <w:b/>
-          <w:bCs/>
-        </w:rPr>
-      </w:pPr>
-      <w:r>
-        <w:rPr>
-          <w:b/>
-          <w:bCs/>
-        </w:rPr>
-        <w:t>7.REPOSITÓRIO GITHUB</w:t>
-      </w:r>
-    </w:p>
-    <w:p>
-      <w:pPr>
-        <w:jc w:val="both"/>
-      </w:pPr>
-      <w:r>
-        <w:t>Descreva o que é o git e  github, sua importância para o projeto (uma delas é o arquivo do código fonte centralizado e sempre com a versão atual), encontre uma forma de reproduzir a estrutura do projeto (imagem?) e coloque a estrutura do README.md (imagem ou tópicos)</w:t>
-      </w:r>
-      <w:r>
-        <w:t>.</w:t>
+        <w:t>projeto na nuvem e facilita o trabalho em equipe, e no Smart Traffic eles são importantes para manter o código organizado, atualizado e acessível.</w:t>
+      </w:r>
+    </w:p>
+    <w:p>
+      <w:pPr>
+        <w:ind w:firstLine="0"/>
+        <w:jc w:val="both"/>
+      </w:pPr>
+      <w:r>
+        <w:t>semaforo-inteligente/</w:t>
+      </w:r>
+    </w:p>
+    <w:p>
+      <w:pPr>
+        <w:ind w:firstLine="0"/>
+        <w:jc w:val="both"/>
+      </w:pPr>
+      <w:r>
+        <w:t>│</w:t>
+      </w:r>
+    </w:p>
+    <w:p>
+      <w:pPr>
+        <w:ind w:firstLine="0"/>
+        <w:jc w:val="both"/>
+      </w:pPr>
+      <w:r>
+        <w:t>├── README.md</w:t>
+      </w:r>
+    </w:p>
+    <w:p>
+      <w:pPr>
+        <w:ind w:firstLine="0"/>
+        <w:jc w:val="both"/>
+      </w:pPr>
+      <w:r>
+        <w:t>├── main.c</w:t>
+      </w:r>
+    </w:p>
+    <w:p>
+      <w:pPr>
+        <w:ind w:firstLine="0"/>
+        <w:jc w:val="both"/>
+      </w:pPr>
+      <w:r>
+        <w:t>├── Docs/</w:t>
+      </w:r>
+    </w:p>
+    <w:p>
+      <w:pPr>
+        <w:ind w:firstLine="0"/>
+        <w:jc w:val="both"/>
+      </w:pPr>
+      <w:r>
+        <w:t xml:space="preserve">    └── Documentacao-Nome-Sobrenome.docx</w:t>
+      </w:r>
+    </w:p>
+    <w:p>
+      <w:pPr>
+        <w:ind w:firstLine="0"/>
+        <w:jc w:val="both"/>
+      </w:pPr>
+      <w:r>
+        <w:t>└── Evidencias/</w:t>
+      </w:r>
+    </w:p>
+    <w:p>
+      <w:pPr>
+        <w:ind w:firstLine="0"/>
+        <w:jc w:val="both"/>
+      </w:pPr>
+      <w:r>
+        <w:t xml:space="preserve">    └── prints/</w:t>
+      </w:r>
+    </w:p>
+    <w:p>
+      <w:pPr>
+        <w:ind w:firstLine="0"/>
+        <w:jc w:val="both"/>
+        <w:rPr>
+          <w:b/>
+          <w:bCs/>
+        </w:rPr>
+      </w:pPr>
+      <w:r>
+        <w:rPr>
+          <w:b/>
+          <w:bCs/>
+        </w:rPr>
+        <w:t>O</w:t>
+      </w:r>
+      <w:r>
+        <w:rPr>
+          <w:b/>
+          <w:bCs/>
+        </w:rPr>
+        <w:t xml:space="preserve"> README.md </w:t>
+      </w:r>
+      <w:r>
+        <w:rPr>
+          <w:b/>
+          <w:bCs/>
+        </w:rPr>
+        <w:t>deverá conter (no arquivo pode ser em tópicos)</w:t>
+      </w:r>
+    </w:p>
+    <w:p>
+      <w:pPr>
+        <w:numPr>
+          <w:ilvl w:val="0"/>
+          <w:numId w:val="10"/>
+        </w:numPr>
+        <w:jc w:val="both"/>
+      </w:pPr>
+      <w:r>
+        <w:t>Nome do projeto:</w:t>
+      </w:r>
+    </w:p>
+    <w:p>
+      <w:pPr>
+        <w:numPr>
+          <w:ilvl w:val="0"/>
+          <w:numId w:val="10"/>
+        </w:numPr>
+        <w:jc w:val="both"/>
+      </w:pPr>
+      <w:r>
+        <w:t>Nome do desenvolvedor:</w:t>
+      </w:r>
+    </w:p>
+    <w:p>
+      <w:pPr>
+        <w:numPr>
+          <w:ilvl w:val="0"/>
+          <w:numId w:val="10"/>
+        </w:numPr>
+        <w:jc w:val="both"/>
+      </w:pPr>
+      <w:r>
+        <w:t>Objetivo do projeto:</w:t>
+      </w:r>
+    </w:p>
+    <w:p>
+      <w:pPr>
+        <w:numPr>
+          <w:ilvl w:val="0"/>
+          <w:numId w:val="10"/>
+        </w:numPr>
+        <w:jc w:val="both"/>
+      </w:pPr>
+      <w:r>
+        <w:t>Linguagem utilizada:</w:t>
+      </w:r>
+    </w:p>
+    <w:p>
+      <w:pPr>
+        <w:numPr>
+          <w:ilvl w:val="0"/>
+          <w:numId w:val="10"/>
+        </w:numPr>
+        <w:jc w:val="both"/>
+      </w:pPr>
+      <w:r>
+        <w:t>Descrição resumida do funcionamento:</w:t>
+      </w:r>
+    </w:p>
+    <w:p>
+      <w:pPr>
+        <w:numPr>
+          <w:ilvl w:val="0"/>
+          <w:numId w:val="10"/>
+        </w:numPr>
+        <w:jc w:val="both"/>
+      </w:pPr>
+      <w:r>
+        <w:t>Como executar o programa, quando houver código:</w:t>
       </w:r>
     </w:p>
     <w:p>
@@ -1927,7 +4080,28 @@
         <w:jc w:val="both"/>
       </w:pPr>
       <w:r>
-        <w:t xml:space="preserve">(apague o que está entre parênteses quando colocar no github, todo livro ou link utilizado colocar nas referências, é em ordem alfabética, os dois itens abaixo são documentos apresentados a vocês, plano de ensino do semestre e o guia) </w:t>
+        <w:t xml:space="preserve">APRENDA ELETRÔNICA. Introdução ao Arduino e sistemas embarcados. Disponível em: </w:t>
+      </w:r>
+      <w:r>
+        <w:t xml:space="preserve">https://www.arduino.cc/. </w:t>
+      </w:r>
+      <w:r>
+        <w:t>Acesso em: 05 maio 2026.</w:t>
+      </w:r>
+    </w:p>
+    <w:p>
+      <w:pPr>
+        <w:ind w:firstLine="0"/>
+        <w:jc w:val="both"/>
+      </w:pPr>
+    </w:p>
+    <w:p>
+      <w:pPr>
+        <w:ind w:firstLine="0"/>
+        <w:jc w:val="both"/>
+      </w:pPr>
+      <w:r>
+        <w:t>STALLINGS, William. Sistemas Operacionais: aspectos internos e princípios de projeto. 8. ed. São Paulo: Pearson, 2015.</w:t>
       </w:r>
     </w:p>
     <w:p>
@@ -2366,6 +4540,155 @@
     </w:lvl>
   </w:abstractNum>
   <w:abstractNum w:abstractNumId="3" w15:restartNumberingAfterBreak="0">
+    <w:nsid w:val="358A31C0"/>
+    <w:multiLevelType w:val="multilevel"/>
+    <w:tmpl w:val="8698F170"/>
+    <w:lvl w:ilvl="0">
+      <w:start w:val="1"/>
+      <w:numFmt w:val="bullet"/>
+      <w:lvlText w:val=""/>
+      <w:lvlJc w:val="left"/>
+      <w:pPr>
+        <w:tabs>
+          <w:tab w:val="num" w:pos="720"/>
+        </w:tabs>
+        <w:ind w:left="720" w:hanging="360"/>
+      </w:pPr>
+      <w:rPr>
+        <w:rFonts w:ascii="Symbol" w:hAnsi="Symbol" w:hint="default"/>
+        <w:sz w:val="20"/>
+      </w:rPr>
+    </w:lvl>
+    <w:lvl w:ilvl="1" w:tentative="1">
+      <w:start w:val="1"/>
+      <w:numFmt w:val="bullet"/>
+      <w:lvlText w:val="o"/>
+      <w:lvlJc w:val="left"/>
+      <w:pPr>
+        <w:tabs>
+          <w:tab w:val="num" w:pos="1440"/>
+        </w:tabs>
+        <w:ind w:left="1440" w:hanging="360"/>
+      </w:pPr>
+      <w:rPr>
+        <w:rFonts w:ascii="Courier New" w:hAnsi="Courier New" w:hint="default"/>
+        <w:sz w:val="20"/>
+      </w:rPr>
+    </w:lvl>
+    <w:lvl w:ilvl="2" w:tentative="1">
+      <w:start w:val="1"/>
+      <w:numFmt w:val="bullet"/>
+      <w:lvlText w:val=""/>
+      <w:lvlJc w:val="left"/>
+      <w:pPr>
+        <w:tabs>
+          <w:tab w:val="num" w:pos="2160"/>
+        </w:tabs>
+        <w:ind w:left="2160" w:hanging="360"/>
+      </w:pPr>
+      <w:rPr>
+        <w:rFonts w:ascii="Wingdings" w:hAnsi="Wingdings" w:hint="default"/>
+        <w:sz w:val="20"/>
+      </w:rPr>
+    </w:lvl>
+    <w:lvl w:ilvl="3" w:tentative="1">
+      <w:start w:val="1"/>
+      <w:numFmt w:val="bullet"/>
+      <w:lvlText w:val=""/>
+      <w:lvlJc w:val="left"/>
+      <w:pPr>
+        <w:tabs>
+          <w:tab w:val="num" w:pos="2880"/>
+        </w:tabs>
+        <w:ind w:left="2880" w:hanging="360"/>
+      </w:pPr>
+      <w:rPr>
+        <w:rFonts w:ascii="Wingdings" w:hAnsi="Wingdings" w:hint="default"/>
+        <w:sz w:val="20"/>
+      </w:rPr>
+    </w:lvl>
+    <w:lvl w:ilvl="4" w:tentative="1">
+      <w:start w:val="1"/>
+      <w:numFmt w:val="bullet"/>
+      <w:lvlText w:val=""/>
+      <w:lvlJc w:val="left"/>
+      <w:pPr>
+        <w:tabs>
+          <w:tab w:val="num" w:pos="3600"/>
+        </w:tabs>
+        <w:ind w:left="3600" w:hanging="360"/>
+      </w:pPr>
+      <w:rPr>
+        <w:rFonts w:ascii="Wingdings" w:hAnsi="Wingdings" w:hint="default"/>
+        <w:sz w:val="20"/>
+      </w:rPr>
+    </w:lvl>
+    <w:lvl w:ilvl="5" w:tentative="1">
+      <w:start w:val="1"/>
+      <w:numFmt w:val="bullet"/>
+      <w:lvlText w:val=""/>
+      <w:lvlJc w:val="left"/>
+      <w:pPr>
+        <w:tabs>
+          <w:tab w:val="num" w:pos="4320"/>
+        </w:tabs>
+        <w:ind w:left="4320" w:hanging="360"/>
+      </w:pPr>
+      <w:rPr>
+        <w:rFonts w:ascii="Wingdings" w:hAnsi="Wingdings" w:hint="default"/>
+        <w:sz w:val="20"/>
+      </w:rPr>
+    </w:lvl>
+    <w:lvl w:ilvl="6" w:tentative="1">
+      <w:start w:val="1"/>
+      <w:numFmt w:val="bullet"/>
+      <w:lvlText w:val=""/>
+      <w:lvlJc w:val="left"/>
+      <w:pPr>
+        <w:tabs>
+          <w:tab w:val="num" w:pos="5040"/>
+        </w:tabs>
+        <w:ind w:left="5040" w:hanging="360"/>
+      </w:pPr>
+      <w:rPr>
+        <w:rFonts w:ascii="Wingdings" w:hAnsi="Wingdings" w:hint="default"/>
+        <w:sz w:val="20"/>
+      </w:rPr>
+    </w:lvl>
+    <w:lvl w:ilvl="7" w:tentative="1">
+      <w:start w:val="1"/>
+      <w:numFmt w:val="bullet"/>
+      <w:lvlText w:val=""/>
+      <w:lvlJc w:val="left"/>
+      <w:pPr>
+        <w:tabs>
+          <w:tab w:val="num" w:pos="5760"/>
+        </w:tabs>
+        <w:ind w:left="5760" w:hanging="360"/>
+      </w:pPr>
+      <w:rPr>
+        <w:rFonts w:ascii="Wingdings" w:hAnsi="Wingdings" w:hint="default"/>
+        <w:sz w:val="20"/>
+      </w:rPr>
+    </w:lvl>
+    <w:lvl w:ilvl="8" w:tentative="1">
+      <w:start w:val="1"/>
+      <w:numFmt w:val="bullet"/>
+      <w:lvlText w:val=""/>
+      <w:lvlJc w:val="left"/>
+      <w:pPr>
+        <w:tabs>
+          <w:tab w:val="num" w:pos="6480"/>
+        </w:tabs>
+        <w:ind w:left="6480" w:hanging="360"/>
+      </w:pPr>
+      <w:rPr>
+        <w:rFonts w:ascii="Wingdings" w:hAnsi="Wingdings" w:hint="default"/>
+        <w:sz w:val="20"/>
+      </w:rPr>
+    </w:lvl>
+  </w:abstractNum>
+  <w:abstractNum w:abstractNumId="4" w15:restartNumberingAfterBreak="0">
     <w:nsid w:val="35A96499"/>
     <w:multiLevelType w:val="hybridMultilevel"/>
     <w:tmpl w:val="0D862136"/>
@@ -2454,7 +4777,7 @@
       </w:pPr>
     </w:lvl>
   </w:abstractNum>
-  <w:abstractNum w:abstractNumId="4" w15:restartNumberingAfterBreak="0">
+  <w:abstractNum w:abstractNumId="5" w15:restartNumberingAfterBreak="0">
     <w:nsid w:val="3F9A35D7"/>
     <w:multiLevelType w:val="multilevel"/>
     <w:tmpl w:val="4B90366E"/>
@@ -2567,7 +4890,7 @@
       </w:rPr>
     </w:lvl>
   </w:abstractNum>
-  <w:abstractNum w:abstractNumId="5" w15:restartNumberingAfterBreak="0">
+  <w:abstractNum w:abstractNumId="6" w15:restartNumberingAfterBreak="0">
     <w:nsid w:val="4CF2273D"/>
     <w:multiLevelType w:val="hybridMultilevel"/>
     <w:tmpl w:val="01F2004C"/>
@@ -2656,7 +4979,7 @@
       </w:pPr>
     </w:lvl>
   </w:abstractNum>
-  <w:abstractNum w:abstractNumId="6" w15:restartNumberingAfterBreak="0">
+  <w:abstractNum w:abstractNumId="7" w15:restartNumberingAfterBreak="0">
     <w:nsid w:val="61F6573F"/>
     <w:multiLevelType w:val="multilevel"/>
     <w:tmpl w:val="AE0A5B5C"/>
@@ -2769,7 +5092,7 @@
       </w:rPr>
     </w:lvl>
   </w:abstractNum>
-  <w:abstractNum w:abstractNumId="7" w15:restartNumberingAfterBreak="0">
+  <w:abstractNum w:abstractNumId="8" w15:restartNumberingAfterBreak="0">
     <w:nsid w:val="6C9B5388"/>
     <w:multiLevelType w:val="hybridMultilevel"/>
     <w:tmpl w:val="D89212E6"/>
@@ -2858,7 +5181,7 @@
       </w:pPr>
     </w:lvl>
   </w:abstractNum>
-  <w:abstractNum w:abstractNumId="8" w15:restartNumberingAfterBreak="0">
+  <w:abstractNum w:abstractNumId="9" w15:restartNumberingAfterBreak="0">
     <w:nsid w:val="71D13723"/>
     <w:multiLevelType w:val="multilevel"/>
     <w:tmpl w:val="0D4EC2B8"/>
@@ -2975,28 +5298,31 @@
     <w:abstractNumId w:val="0"/>
   </w:num>
   <w:num w:numId="2" w16cid:durableId="2008098039">
-    <w:abstractNumId w:val="3"/>
+    <w:abstractNumId w:val="4"/>
   </w:num>
   <w:num w:numId="3" w16cid:durableId="1180244290">
     <w:abstractNumId w:val="1"/>
   </w:num>
   <w:num w:numId="4" w16cid:durableId="813909010">
-    <w:abstractNumId w:val="6"/>
+    <w:abstractNumId w:val="7"/>
   </w:num>
   <w:num w:numId="5" w16cid:durableId="1337223600">
-    <w:abstractNumId w:val="4"/>
+    <w:abstractNumId w:val="5"/>
   </w:num>
   <w:num w:numId="6" w16cid:durableId="1297175663">
-    <w:abstractNumId w:val="7"/>
+    <w:abstractNumId w:val="8"/>
   </w:num>
   <w:num w:numId="7" w16cid:durableId="572661350">
     <w:abstractNumId w:val="2"/>
   </w:num>
   <w:num w:numId="8" w16cid:durableId="625620011">
-    <w:abstractNumId w:val="5"/>
+    <w:abstractNumId w:val="6"/>
   </w:num>
   <w:num w:numId="9" w16cid:durableId="1612396975">
-    <w:abstractNumId w:val="8"/>
+    <w:abstractNumId w:val="9"/>
+  </w:num>
+  <w:num w:numId="10" w16cid:durableId="237129804">
+    <w:abstractNumId w:val="3"/>
   </w:num>
 </w:numbering>
 </file>
@@ -3431,6 +5757,29 @@
       <w:szCs w:val="32"/>
     </w:rPr>
   </w:style>
+  <w:style w:type="paragraph" w:styleId="Ttulo2">
+    <w:name w:val="heading 2"/>
+    <w:basedOn w:val="Normal"/>
+    <w:next w:val="Normal"/>
+    <w:link w:val="Ttulo2Char"/>
+    <w:uiPriority w:val="9"/>
+    <w:semiHidden/>
+    <w:unhideWhenUsed/>
+    <w:qFormat/>
+    <w:rsid w:val="009E3035"/>
+    <w:pPr>
+      <w:keepNext/>
+      <w:keepLines/>
+      <w:spacing w:before="40"/>
+      <w:outlineLvl w:val="1"/>
+    </w:pPr>
+    <w:rPr>
+      <w:rFonts w:asciiTheme="majorHAnsi" w:eastAsiaTheme="majorEastAsia" w:hAnsiTheme="majorHAnsi" w:cstheme="majorBidi"/>
+      <w:color w:val="2F5496" w:themeColor="accent1" w:themeShade="BF"/>
+      <w:sz w:val="26"/>
+      <w:szCs w:val="26"/>
+    </w:rPr>
+  </w:style>
   <w:style w:type="character" w:default="1" w:styleId="Fontepargpadro">
     <w:name w:val="Default Paragraph Font"/>
     <w:uiPriority w:val="1"/>
@@ -3482,6 +5831,136 @@
       <w:ind w:left="720"/>
       <w:contextualSpacing/>
     </w:pPr>
+  </w:style>
+  <w:style w:type="table" w:styleId="Tabelacomgrade">
+    <w:name w:val="Table Grid"/>
+    <w:basedOn w:val="Tabelanormal"/>
+    <w:uiPriority w:val="39"/>
+    <w:rsid w:val="00672743"/>
+    <w:pPr>
+      <w:spacing w:after="0" w:line="240" w:lineRule="auto"/>
+    </w:pPr>
+    <w:tblPr>
+      <w:tblBorders>
+        <w:top w:val="single" w:sz="4" w:space="0" w:color="auto"/>
+        <w:left w:val="single" w:sz="4" w:space="0" w:color="auto"/>
+        <w:bottom w:val="single" w:sz="4" w:space="0" w:color="auto"/>
+        <w:right w:val="single" w:sz="4" w:space="0" w:color="auto"/>
+        <w:insideH w:val="single" w:sz="4" w:space="0" w:color="auto"/>
+        <w:insideV w:val="single" w:sz="4" w:space="0" w:color="auto"/>
+      </w:tblBorders>
+    </w:tblPr>
+  </w:style>
+  <w:style w:type="character" w:customStyle="1" w:styleId="Ttulo2Char">
+    <w:name w:val="Título 2 Char"/>
+    <w:basedOn w:val="Fontepargpadro"/>
+    <w:link w:val="Ttulo2"/>
+    <w:uiPriority w:val="9"/>
+    <w:semiHidden/>
+    <w:rsid w:val="009E3035"/>
+    <w:rPr>
+      <w:rFonts w:asciiTheme="majorHAnsi" w:eastAsiaTheme="majorEastAsia" w:hAnsiTheme="majorHAnsi" w:cstheme="majorBidi"/>
+      <w:color w:val="2F5496" w:themeColor="accent1" w:themeShade="BF"/>
+      <w:sz w:val="26"/>
+      <w:szCs w:val="26"/>
+    </w:rPr>
+  </w:style>
+  <w:style w:type="character" w:styleId="Hyperlink">
+    <w:name w:val="Hyperlink"/>
+    <w:basedOn w:val="Fontepargpadro"/>
+    <w:uiPriority w:val="99"/>
+    <w:unhideWhenUsed/>
+    <w:rsid w:val="009E3035"/>
+    <w:rPr>
+      <w:color w:val="0563C1" w:themeColor="hyperlink"/>
+      <w:u w:val="single"/>
+    </w:rPr>
+  </w:style>
+  <w:style w:type="character" w:styleId="MenoPendente">
+    <w:name w:val="Unresolved Mention"/>
+    <w:basedOn w:val="Fontepargpadro"/>
+    <w:uiPriority w:val="99"/>
+    <w:semiHidden/>
+    <w:unhideWhenUsed/>
+    <w:rsid w:val="009E3035"/>
+    <w:rPr>
+      <w:color w:val="605E5C"/>
+      <w:shd w:val="clear" w:color="auto" w:fill="E1DFDD"/>
+    </w:rPr>
+  </w:style>
+  <w:style w:type="paragraph" w:styleId="CabealhodoSumrio">
+    <w:name w:val="TOC Heading"/>
+    <w:basedOn w:val="Ttulo1"/>
+    <w:next w:val="Normal"/>
+    <w:uiPriority w:val="39"/>
+    <w:unhideWhenUsed/>
+    <w:qFormat/>
+    <w:rsid w:val="001D774C"/>
+    <w:pPr>
+      <w:spacing w:before="240" w:line="259" w:lineRule="auto"/>
+      <w:outlineLvl w:val="9"/>
+    </w:pPr>
+    <w:rPr>
+      <w:rFonts w:asciiTheme="majorHAnsi" w:hAnsiTheme="majorHAnsi"/>
+      <w:b w:val="0"/>
+      <w:color w:val="2F5496" w:themeColor="accent1" w:themeShade="BF"/>
+      <w:sz w:val="32"/>
+      <w:lang w:eastAsia="pt-BR"/>
+    </w:rPr>
+  </w:style>
+  <w:style w:type="paragraph" w:styleId="Sumrio2">
+    <w:name w:val="toc 2"/>
+    <w:basedOn w:val="Normal"/>
+    <w:next w:val="Normal"/>
+    <w:autoRedefine/>
+    <w:uiPriority w:val="39"/>
+    <w:unhideWhenUsed/>
+    <w:rsid w:val="001D774C"/>
+    <w:pPr>
+      <w:spacing w:after="100" w:line="259" w:lineRule="auto"/>
+      <w:ind w:left="220" w:firstLine="0"/>
+    </w:pPr>
+    <w:rPr>
+      <w:rFonts w:asciiTheme="minorHAnsi" w:eastAsiaTheme="minorEastAsia" w:hAnsiTheme="minorHAnsi" w:cs="Times New Roman"/>
+      <w:sz w:val="22"/>
+      <w:lang w:eastAsia="pt-BR"/>
+    </w:rPr>
+  </w:style>
+  <w:style w:type="paragraph" w:styleId="Sumrio1">
+    <w:name w:val="toc 1"/>
+    <w:basedOn w:val="Normal"/>
+    <w:next w:val="Normal"/>
+    <w:autoRedefine/>
+    <w:uiPriority w:val="39"/>
+    <w:unhideWhenUsed/>
+    <w:rsid w:val="001D774C"/>
+    <w:pPr>
+      <w:spacing w:after="100" w:line="259" w:lineRule="auto"/>
+      <w:ind w:firstLine="0"/>
+    </w:pPr>
+    <w:rPr>
+      <w:rFonts w:asciiTheme="minorHAnsi" w:eastAsiaTheme="minorEastAsia" w:hAnsiTheme="minorHAnsi" w:cs="Times New Roman"/>
+      <w:sz w:val="22"/>
+      <w:lang w:eastAsia="pt-BR"/>
+    </w:rPr>
+  </w:style>
+  <w:style w:type="paragraph" w:styleId="Sumrio3">
+    <w:name w:val="toc 3"/>
+    <w:basedOn w:val="Normal"/>
+    <w:next w:val="Normal"/>
+    <w:autoRedefine/>
+    <w:uiPriority w:val="39"/>
+    <w:unhideWhenUsed/>
+    <w:rsid w:val="001D774C"/>
+    <w:pPr>
+      <w:spacing w:after="100" w:line="259" w:lineRule="auto"/>
+      <w:ind w:left="440" w:firstLine="0"/>
+    </w:pPr>
+    <w:rPr>
+      <w:rFonts w:asciiTheme="minorHAnsi" w:eastAsiaTheme="minorEastAsia" w:hAnsiTheme="minorHAnsi" w:cs="Times New Roman"/>
+      <w:sz w:val="22"/>
+      <w:lang w:eastAsia="pt-BR"/>
+    </w:rPr>
   </w:style>
 </w:styles>
 </file>
@@ -3779,4 +6258,16 @@
     </a:ext>
   </a:extLst>
 </a:theme>
+</file>
+
+<file path=customXml/item1.xml><?xml version="1.0" encoding="utf-8"?>
+<b:Sources xmlns:b="http://schemas.openxmlformats.org/officeDocument/2006/bibliography" xmlns="http://schemas.openxmlformats.org/officeDocument/2006/bibliography" SelectedStyle="\APASixthEditionOfficeOnline.xsl" StyleName="APA" Version="6"/>
+</file>
+
+<file path=customXml/itemProps1.xml><?xml version="1.0" encoding="utf-8"?>
+<ds:datastoreItem xmlns:ds="http://schemas.openxmlformats.org/officeDocument/2006/customXml" ds:itemID="{F64D51C6-66C4-4B2A-9170-C6092E2AD616}">
+  <ds:schemaRefs>
+    <ds:schemaRef ds:uri="http://schemas.openxmlformats.org/officeDocument/2006/bibliography"/>
+  </ds:schemaRefs>
+</ds:datastoreItem>
 </file>
</xml_diff>